<commit_message>
Se agrega información relacionada a IAM
Se agrega la información relacionada a la investigación IAM en las secciones correspondientes.
</commit_message>
<xml_diff>
--- a/00_Gestion_Proyecto/Documentos_a_Entregar/SN6_Fase0_IAM_ZeroTrust.docx
+++ b/00_Gestion_Proyecto/Documentos_a_Entregar/SN6_Fase0_IAM_ZeroTrust.docx
@@ -441,7 +441,25 @@
           <w:sz w:val="28"/>
           <w:szCs w:val="28"/>
         </w:rPr>
-        <w:t>0 – Onboarding y Planificación</w:t>
+        <w:t xml:space="preserve">0 – </w:t>
+      </w:r>
+      <w:proofErr w:type="spellStart"/>
+      <w:r>
+        <w:rPr>
+          <w:rFonts w:ascii="Arial" w:eastAsia="Museo Sans 300" w:hAnsi="Arial" w:cs="Arial"/>
+          <w:sz w:val="28"/>
+          <w:szCs w:val="28"/>
+        </w:rPr>
+        <w:t>Onboarding</w:t>
+      </w:r>
+      <w:proofErr w:type="spellEnd"/>
+      <w:r>
+        <w:rPr>
+          <w:rFonts w:ascii="Arial" w:eastAsia="Museo Sans 300" w:hAnsi="Arial" w:cs="Arial"/>
+          <w:sz w:val="28"/>
+          <w:szCs w:val="28"/>
+        </w:rPr>
+        <w:t xml:space="preserve"> y Planificación</w:t>
       </w:r>
     </w:p>
     <w:p>
@@ -601,7 +619,7 @@
     </w:p>
     <w:tbl>
       <w:tblPr>
-        <w:tblStyle w:val="Tablaconcuadrcula"/>
+        <w:tblStyle w:val="TableGrid"/>
         <w:tblW w:w="9924" w:type="dxa"/>
         <w:tblInd w:w="-431" w:type="dxa"/>
         <w:tblLook w:val="04A0" w:firstRow="1" w:lastRow="0" w:firstColumn="1" w:lastColumn="0" w:noHBand="0" w:noVBand="1"/>
@@ -686,12 +704,28 @@
                 <w:rFonts w:ascii="Arial" w:eastAsia="Museo Sans 300" w:hAnsi="Arial" w:cs="Arial"/>
               </w:rPr>
             </w:pPr>
+            <w:proofErr w:type="spellStart"/>
             <w:r>
               <w:rPr>
                 <w:rFonts w:ascii="Arial" w:eastAsia="Museo Sans 300" w:hAnsi="Arial" w:cs="Arial"/>
               </w:rPr>
-              <w:t>Neldy Liliana Hernandez Huezo</w:t>
-            </w:r>
+              <w:t>Neldy</w:t>
+            </w:r>
+            <w:proofErr w:type="spellEnd"/>
+            <w:r>
+              <w:rPr>
+                <w:rFonts w:ascii="Arial" w:eastAsia="Museo Sans 300" w:hAnsi="Arial" w:cs="Arial"/>
+              </w:rPr>
+              <w:t xml:space="preserve"> Liliana Hernandez </w:t>
+            </w:r>
+            <w:proofErr w:type="spellStart"/>
+            <w:r>
+              <w:rPr>
+                <w:rFonts w:ascii="Arial" w:eastAsia="Museo Sans 300" w:hAnsi="Arial" w:cs="Arial"/>
+              </w:rPr>
+              <w:t>Huezo</w:t>
+            </w:r>
+            <w:proofErr w:type="spellEnd"/>
           </w:p>
         </w:tc>
         <w:tc>
@@ -789,7 +823,21 @@
               <w:rPr>
                 <w:rFonts w:ascii="Arial" w:eastAsia="Museo Sans 300" w:hAnsi="Arial" w:cs="Arial"/>
               </w:rPr>
-              <w:t>Ingeniero Cloud / Backend Jr.</w:t>
+              <w:t xml:space="preserve">Ingeniero Cloud / </w:t>
+            </w:r>
+            <w:proofErr w:type="spellStart"/>
+            <w:r>
+              <w:rPr>
+                <w:rFonts w:ascii="Arial" w:eastAsia="Museo Sans 300" w:hAnsi="Arial" w:cs="Arial"/>
+              </w:rPr>
+              <w:t>Backend</w:t>
+            </w:r>
+            <w:proofErr w:type="spellEnd"/>
+            <w:r>
+              <w:rPr>
+                <w:rFonts w:ascii="Arial" w:eastAsia="Museo Sans 300" w:hAnsi="Arial" w:cs="Arial"/>
+              </w:rPr>
+              <w:t xml:space="preserve"> Jr.</w:t>
             </w:r>
           </w:p>
         </w:tc>
@@ -825,11 +873,33 @@
                 <w:rFonts w:ascii="Arial" w:eastAsia="Museo Sans 300" w:hAnsi="Arial" w:cs="Arial"/>
               </w:rPr>
             </w:pPr>
+            <w:proofErr w:type="spellStart"/>
             <w:r>
               <w:rPr>
                 <w:rFonts w:ascii="Arial" w:eastAsia="Museo Sans 300" w:hAnsi="Arial" w:cs="Arial"/>
               </w:rPr>
-              <w:t>Frontend / Dashboard Jr.</w:t>
+              <w:t>Frontend</w:t>
+            </w:r>
+            <w:proofErr w:type="spellEnd"/>
+            <w:r>
+              <w:rPr>
+                <w:rFonts w:ascii="Arial" w:eastAsia="Museo Sans 300" w:hAnsi="Arial" w:cs="Arial"/>
+              </w:rPr>
+              <w:t xml:space="preserve"> / </w:t>
+            </w:r>
+            <w:proofErr w:type="spellStart"/>
+            <w:r>
+              <w:rPr>
+                <w:rFonts w:ascii="Arial" w:eastAsia="Museo Sans 300" w:hAnsi="Arial" w:cs="Arial"/>
+              </w:rPr>
+              <w:t>Dashboard</w:t>
+            </w:r>
+            <w:proofErr w:type="spellEnd"/>
+            <w:r>
+              <w:rPr>
+                <w:rFonts w:ascii="Arial" w:eastAsia="Museo Sans 300" w:hAnsi="Arial" w:cs="Arial"/>
+              </w:rPr>
+              <w:t xml:space="preserve"> Jr.</w:t>
             </w:r>
           </w:p>
         </w:tc>
@@ -1031,7 +1101,7 @@
       <w:sdtContent>
         <w:p>
           <w:pPr>
-            <w:pStyle w:val="TtuloTDC"/>
+            <w:pStyle w:val="TOCHeading"/>
             <w:rPr>
               <w:rFonts w:ascii="Arial" w:hAnsi="Arial" w:cs="Arial"/>
               <w:lang w:val="es-ES"/>
@@ -1047,7 +1117,7 @@
         </w:p>
         <w:p>
           <w:pPr>
-            <w:pStyle w:val="TDC1"/>
+            <w:pStyle w:val="TOC1"/>
             <w:tabs>
               <w:tab w:val="right" w:leader="dot" w:pos="8828"/>
             </w:tabs>
@@ -1077,7 +1147,7 @@
           <w:hyperlink w:anchor="_Toc231965215" w:history="1">
             <w:r>
               <w:rPr>
-                <w:rStyle w:val="Hipervnculo"/>
+                <w:rStyle w:val="Hyperlink"/>
                 <w:rFonts w:ascii="Arial" w:eastAsia="Museo Sans 300" w:hAnsi="Arial" w:cs="Arial"/>
                 <w:noProof/>
               </w:rPr>
@@ -1142,7 +1212,7 @@
         </w:p>
         <w:p>
           <w:pPr>
-            <w:pStyle w:val="TDC1"/>
+            <w:pStyle w:val="TOC1"/>
             <w:tabs>
               <w:tab w:val="right" w:leader="dot" w:pos="8828"/>
             </w:tabs>
@@ -1154,7 +1224,7 @@
           <w:hyperlink w:anchor="_Toc231965216" w:history="1">
             <w:r>
               <w:rPr>
-                <w:rStyle w:val="Hipervnculo"/>
+                <w:rStyle w:val="Hyperlink"/>
                 <w:rFonts w:ascii="Arial" w:eastAsia="Museo Sans 300" w:hAnsi="Arial" w:cs="Arial"/>
                 <w:bCs/>
                 <w:noProof/>
@@ -1220,7 +1290,7 @@
         </w:p>
         <w:p>
           <w:pPr>
-            <w:pStyle w:val="TDC2"/>
+            <w:pStyle w:val="TOC2"/>
             <w:tabs>
               <w:tab w:val="right" w:leader="dot" w:pos="8828"/>
             </w:tabs>
@@ -1232,7 +1302,7 @@
           <w:hyperlink w:anchor="_Toc231965217" w:history="1">
             <w:r>
               <w:rPr>
-                <w:rStyle w:val="Hipervnculo"/>
+                <w:rStyle w:val="Hyperlink"/>
                 <w:rFonts w:ascii="Arial" w:eastAsia="Times New Roman" w:hAnsi="Arial" w:cs="Arial"/>
                 <w:noProof/>
                 <w:lang w:eastAsia="es-SV"/>
@@ -1298,7 +1368,7 @@
         </w:p>
         <w:p>
           <w:pPr>
-            <w:pStyle w:val="TDC2"/>
+            <w:pStyle w:val="TOC2"/>
             <w:tabs>
               <w:tab w:val="right" w:leader="dot" w:pos="8828"/>
             </w:tabs>
@@ -1310,7 +1380,7 @@
           <w:hyperlink w:anchor="_Toc231965218" w:history="1">
             <w:r>
               <w:rPr>
-                <w:rStyle w:val="Hipervnculo"/>
+                <w:rStyle w:val="Hyperlink"/>
                 <w:rFonts w:ascii="Arial" w:eastAsia="Times New Roman" w:hAnsi="Arial" w:cs="Arial"/>
                 <w:noProof/>
                 <w:lang w:eastAsia="es-SV"/>
@@ -1376,7 +1446,7 @@
         </w:p>
         <w:p>
           <w:pPr>
-            <w:pStyle w:val="TDC2"/>
+            <w:pStyle w:val="TOC2"/>
             <w:tabs>
               <w:tab w:val="right" w:leader="dot" w:pos="8828"/>
             </w:tabs>
@@ -1388,7 +1458,7 @@
           <w:hyperlink w:anchor="_Toc231965219" w:history="1">
             <w:r>
               <w:rPr>
-                <w:rStyle w:val="Hipervnculo"/>
+                <w:rStyle w:val="Hyperlink"/>
                 <w:rFonts w:ascii="Arial" w:eastAsia="Times New Roman" w:hAnsi="Arial" w:cs="Arial"/>
                 <w:noProof/>
                 <w:lang w:eastAsia="es-SV"/>
@@ -1454,7 +1524,7 @@
         </w:p>
         <w:p>
           <w:pPr>
-            <w:pStyle w:val="TDC1"/>
+            <w:pStyle w:val="TOC1"/>
             <w:tabs>
               <w:tab w:val="right" w:leader="dot" w:pos="8828"/>
             </w:tabs>
@@ -1466,7 +1536,7 @@
           <w:hyperlink w:anchor="_Toc231965220" w:history="1">
             <w:r>
               <w:rPr>
-                <w:rStyle w:val="Hipervnculo"/>
+                <w:rStyle w:val="Hyperlink"/>
                 <w:rFonts w:ascii="Arial" w:eastAsia="Museo Sans 300" w:hAnsi="Arial" w:cs="Arial"/>
                 <w:noProof/>
               </w:rPr>
@@ -1531,7 +1601,7 @@
         </w:p>
         <w:p>
           <w:pPr>
-            <w:pStyle w:val="TDC2"/>
+            <w:pStyle w:val="TOC2"/>
             <w:tabs>
               <w:tab w:val="right" w:leader="dot" w:pos="8828"/>
             </w:tabs>
@@ -1543,7 +1613,7 @@
           <w:hyperlink w:anchor="_Toc231965221" w:history="1">
             <w:r>
               <w:rPr>
-                <w:rStyle w:val="Hipervnculo"/>
+                <w:rStyle w:val="Hyperlink"/>
                 <w:rFonts w:ascii="Arial" w:eastAsia="Museo Sans 300" w:hAnsi="Arial" w:cs="Arial"/>
                 <w:noProof/>
               </w:rPr>
@@ -1608,7 +1678,7 @@
         </w:p>
         <w:p>
           <w:pPr>
-            <w:pStyle w:val="TDC2"/>
+            <w:pStyle w:val="TOC2"/>
             <w:tabs>
               <w:tab w:val="right" w:leader="dot" w:pos="8828"/>
             </w:tabs>
@@ -1620,7 +1690,7 @@
           <w:hyperlink w:anchor="_Toc231965222" w:history="1">
             <w:r>
               <w:rPr>
-                <w:rStyle w:val="Hipervnculo"/>
+                <w:rStyle w:val="Hyperlink"/>
                 <w:rFonts w:ascii="Arial" w:eastAsia="Museo Sans 300" w:hAnsi="Arial" w:cs="Arial"/>
                 <w:noProof/>
               </w:rPr>
@@ -1685,7 +1755,7 @@
         </w:p>
         <w:p>
           <w:pPr>
-            <w:pStyle w:val="TDC2"/>
+            <w:pStyle w:val="TOC2"/>
             <w:tabs>
               <w:tab w:val="right" w:leader="dot" w:pos="8828"/>
             </w:tabs>
@@ -1697,7 +1767,7 @@
           <w:hyperlink w:anchor="_Toc231965223" w:history="1">
             <w:r>
               <w:rPr>
-                <w:rStyle w:val="Hipervnculo"/>
+                <w:rStyle w:val="Hyperlink"/>
                 <w:rFonts w:ascii="Arial" w:eastAsia="Museo Sans 300" w:hAnsi="Arial" w:cs="Arial"/>
                 <w:noProof/>
               </w:rPr>
@@ -1762,7 +1832,7 @@
         </w:p>
         <w:p>
           <w:pPr>
-            <w:pStyle w:val="TDC1"/>
+            <w:pStyle w:val="TOC1"/>
             <w:tabs>
               <w:tab w:val="right" w:leader="dot" w:pos="8828"/>
             </w:tabs>
@@ -1774,7 +1844,7 @@
           <w:hyperlink w:anchor="_Toc231965224" w:history="1">
             <w:r>
               <w:rPr>
-                <w:rStyle w:val="Hipervnculo"/>
+                <w:rStyle w:val="Hyperlink"/>
                 <w:rFonts w:ascii="Arial" w:eastAsia="Museo Sans 300" w:hAnsi="Arial" w:cs="Arial"/>
                 <w:noProof/>
               </w:rPr>
@@ -1839,7 +1909,7 @@
         </w:p>
         <w:p>
           <w:pPr>
-            <w:pStyle w:val="TDC2"/>
+            <w:pStyle w:val="TOC2"/>
             <w:tabs>
               <w:tab w:val="right" w:leader="dot" w:pos="8828"/>
             </w:tabs>
@@ -1851,7 +1921,7 @@
           <w:hyperlink w:anchor="_Toc231965225" w:history="1">
             <w:r>
               <w:rPr>
-                <w:rStyle w:val="Hipervnculo"/>
+                <w:rStyle w:val="Hyperlink"/>
                 <w:rFonts w:ascii="Arial" w:eastAsia="Museo Sans 300" w:hAnsi="Arial" w:cs="Arial"/>
                 <w:noProof/>
               </w:rPr>
@@ -1916,7 +1986,7 @@
         </w:p>
         <w:p>
           <w:pPr>
-            <w:pStyle w:val="TDC2"/>
+            <w:pStyle w:val="TOC2"/>
             <w:tabs>
               <w:tab w:val="right" w:leader="dot" w:pos="8828"/>
             </w:tabs>
@@ -1928,7 +1998,7 @@
           <w:hyperlink w:anchor="_Toc231965226" w:history="1">
             <w:r>
               <w:rPr>
-                <w:rStyle w:val="Hipervnculo"/>
+                <w:rStyle w:val="Hyperlink"/>
                 <w:rFonts w:ascii="Arial" w:eastAsia="Museo Sans 300" w:hAnsi="Arial" w:cs="Arial"/>
                 <w:noProof/>
               </w:rPr>
@@ -1993,7 +2063,7 @@
         </w:p>
         <w:p>
           <w:pPr>
-            <w:pStyle w:val="TDC2"/>
+            <w:pStyle w:val="TOC2"/>
             <w:tabs>
               <w:tab w:val="right" w:leader="dot" w:pos="8828"/>
             </w:tabs>
@@ -2005,7 +2075,7 @@
           <w:hyperlink w:anchor="_Toc231965227" w:history="1">
             <w:r>
               <w:rPr>
-                <w:rStyle w:val="Hipervnculo"/>
+                <w:rStyle w:val="Hyperlink"/>
                 <w:rFonts w:ascii="Arial" w:eastAsia="Museo Sans 300" w:hAnsi="Arial" w:cs="Arial"/>
                 <w:noProof/>
               </w:rPr>
@@ -2070,7 +2140,7 @@
         </w:p>
         <w:p>
           <w:pPr>
-            <w:pStyle w:val="TDC1"/>
+            <w:pStyle w:val="TOC1"/>
             <w:tabs>
               <w:tab w:val="right" w:leader="dot" w:pos="8828"/>
             </w:tabs>
@@ -2082,7 +2152,7 @@
           <w:hyperlink w:anchor="_Toc231965228" w:history="1">
             <w:r>
               <w:rPr>
-                <w:rStyle w:val="Hipervnculo"/>
+                <w:rStyle w:val="Hyperlink"/>
                 <w:rFonts w:ascii="Arial" w:eastAsia="Museo Sans 300" w:hAnsi="Arial" w:cs="Arial"/>
                 <w:noProof/>
               </w:rPr>
@@ -2147,7 +2217,7 @@
         </w:p>
         <w:p>
           <w:pPr>
-            <w:pStyle w:val="TDC2"/>
+            <w:pStyle w:val="TOC2"/>
             <w:tabs>
               <w:tab w:val="right" w:leader="dot" w:pos="8828"/>
             </w:tabs>
@@ -2159,7 +2229,7 @@
           <w:hyperlink w:anchor="_Toc231965229" w:history="1">
             <w:r>
               <w:rPr>
-                <w:rStyle w:val="Hipervnculo"/>
+                <w:rStyle w:val="Hyperlink"/>
                 <w:rFonts w:ascii="Arial" w:hAnsi="Arial" w:cs="Arial"/>
                 <w:noProof/>
               </w:rPr>
@@ -2224,7 +2294,7 @@
         </w:p>
         <w:p>
           <w:pPr>
-            <w:pStyle w:val="TDC2"/>
+            <w:pStyle w:val="TOC2"/>
             <w:tabs>
               <w:tab w:val="right" w:leader="dot" w:pos="8828"/>
             </w:tabs>
@@ -2236,7 +2306,7 @@
           <w:hyperlink w:anchor="_Toc231965230" w:history="1">
             <w:r>
               <w:rPr>
-                <w:rStyle w:val="Hipervnculo"/>
+                <w:rStyle w:val="Hyperlink"/>
                 <w:rFonts w:ascii="Arial" w:eastAsia="Museo Sans 300" w:hAnsi="Arial" w:cs="Arial"/>
                 <w:noProof/>
               </w:rPr>
@@ -2481,7 +2551,7 @@
     </w:p>
     <w:p>
       <w:pPr>
-        <w:pStyle w:val="Ttulo1"/>
+        <w:pStyle w:val="Heading1"/>
         <w:rPr>
           <w:rFonts w:eastAsia="Museo Sans 300" w:cs="Arial"/>
         </w:rPr>
@@ -2497,7 +2567,7 @@
     </w:p>
     <w:p>
       <w:pPr>
-        <w:pStyle w:val="Ttulo1"/>
+        <w:pStyle w:val="Heading1"/>
         <w:rPr>
           <w:rFonts w:eastAsia="Museo Sans 300" w:cs="Arial"/>
           <w:b w:val="0"/>
@@ -2515,12 +2585,34 @@
           <w:sz w:val="24"/>
           <w:szCs w:val="24"/>
         </w:rPr>
-        <w:t>Durante la Fase 0 del proyecto se realizó el proceso de onboarding y planificación del equipo de trabajo. Se definieron los roles y responsabilidades de los integrantes, se establecieron los canales oficiales de comunicación y se inició la organización de los recursos necesarios para la ejecución del proyecto. Actualmente el proyecto se encuentra en etapa de planificación y evaluación tecnológica para la selección de herramientas. Como riesgos iniciales se identifican la necesidad de seleccionar tecnologías adecuadas para el proyecto, la curva de aprendizaje asociada a algunas herramientas y posibles limitaciones de recursos en plataformas gratuitas.</w:t>
-      </w:r>
-    </w:p>
-    <w:p>
-      <w:pPr>
-        <w:pStyle w:val="Ttulo1"/>
+        <w:t xml:space="preserve">Durante la Fase 0 del proyecto se realizó el proceso de </w:t>
+      </w:r>
+      <w:proofErr w:type="spellStart"/>
+      <w:r>
+        <w:rPr>
+          <w:rFonts w:eastAsia="Museo Sans 300" w:cs="Arial"/>
+          <w:b w:val="0"/>
+          <w:color w:val="auto"/>
+          <w:sz w:val="24"/>
+          <w:szCs w:val="24"/>
+        </w:rPr>
+        <w:t>onboarding</w:t>
+      </w:r>
+      <w:proofErr w:type="spellEnd"/>
+      <w:r>
+        <w:rPr>
+          <w:rFonts w:eastAsia="Museo Sans 300" w:cs="Arial"/>
+          <w:b w:val="0"/>
+          <w:color w:val="auto"/>
+          <w:sz w:val="24"/>
+          <w:szCs w:val="24"/>
+        </w:rPr>
+        <w:t xml:space="preserve"> y planificación del equipo de trabajo. Se definieron los roles y responsabilidades de los integrantes, se establecieron los canales oficiales de comunicación y se inició la organización de los recursos necesarios para la ejecución del proyecto. Actualmente el proyecto se encuentra en etapa de planificación y evaluación tecnológica para la selección de herramientas. Como riesgos iniciales se identifican la necesidad de seleccionar tecnologías adecuadas para el proyecto, la curva de aprendizaje asociada a algunas herramientas y posibles limitaciones de recursos en plataformas gratuitas.</w:t>
+      </w:r>
+    </w:p>
+    <w:p>
+      <w:pPr>
+        <w:pStyle w:val="Heading1"/>
         <w:rPr>
           <w:rFonts w:eastAsia="Museo Sans 300" w:cs="Arial"/>
           <w:bCs/>
@@ -2550,7 +2642,7 @@
     </w:p>
     <w:p>
       <w:pPr>
-        <w:pStyle w:val="Ttulo2"/>
+        <w:pStyle w:val="Heading2"/>
         <w:rPr>
           <w:rFonts w:eastAsia="Times New Roman" w:cs="Arial"/>
           <w:lang w:eastAsia="es-SV"/>
@@ -2568,7 +2660,96 @@
     </w:p>
     <w:p>
       <w:pPr>
-        <w:pStyle w:val="Ttulo2"/>
+        <w:rPr>
+          <w:lang w:eastAsia="es-SV"/>
+        </w:rPr>
+      </w:pPr>
+    </w:p>
+    <w:p>
+      <w:pPr>
+        <w:rPr>
+          <w:lang w:eastAsia="es-SV"/>
+        </w:rPr>
+      </w:pPr>
+      <w:r>
+        <w:rPr>
+          <w:lang w:eastAsia="es-SV"/>
+        </w:rPr>
+        <w:t>IAM</w:t>
+      </w:r>
+    </w:p>
+    <w:p>
+      <w:pPr>
+        <w:rPr>
+          <w:lang w:eastAsia="es-SV"/>
+        </w:rPr>
+      </w:pPr>
+    </w:p>
+    <w:p>
+      <w:pPr>
+        <w:rPr>
+          <w:lang w:eastAsia="es-SV"/>
+        </w:rPr>
+      </w:pPr>
+      <w:r>
+        <w:rPr>
+          <w:lang w:eastAsia="es-SV"/>
+        </w:rPr>
+        <w:t xml:space="preserve">Para determinar la plataforma idónea, se evaluaron soluciones de tipo </w:t>
+      </w:r>
+      <w:proofErr w:type="spellStart"/>
+      <w:r>
+        <w:rPr>
+          <w:lang w:eastAsia="es-SV"/>
+        </w:rPr>
+        <w:t>Identity</w:t>
+      </w:r>
+      <w:proofErr w:type="spellEnd"/>
+      <w:r>
+        <w:rPr>
+          <w:lang w:eastAsia="es-SV"/>
+        </w:rPr>
+        <w:t xml:space="preserve"> as a Service basadas en la nube pública y alternativas </w:t>
+      </w:r>
+      <w:proofErr w:type="spellStart"/>
+      <w:r>
+        <w:rPr>
+          <w:lang w:eastAsia="es-SV"/>
+        </w:rPr>
+        <w:t>self</w:t>
+      </w:r>
+      <w:proofErr w:type="spellEnd"/>
+      <w:r>
+        <w:rPr>
+          <w:lang w:eastAsia="es-SV"/>
+        </w:rPr>
+        <w:t xml:space="preserve"> </w:t>
+      </w:r>
+      <w:proofErr w:type="spellStart"/>
+      <w:r>
+        <w:rPr>
+          <w:lang w:eastAsia="es-SV"/>
+        </w:rPr>
+        <w:t>hosted</w:t>
+      </w:r>
+      <w:proofErr w:type="spellEnd"/>
+      <w:r>
+        <w:rPr>
+          <w:lang w:eastAsia="es-SV"/>
+        </w:rPr>
+        <w:t>, midiendo su capacidad para mitigar los riesgos del entorno de la institución educativa.</w:t>
+      </w:r>
+    </w:p>
+    <w:p>
+      <w:pPr>
+        <w:rPr>
+          <w:lang w:eastAsia="es-SV"/>
+        </w:rPr>
+      </w:pPr>
+    </w:p>
+    <w:p>
+      <w:pPr>
+        <w:pStyle w:val="Heading2"/>
         <w:rPr>
           <w:rFonts w:eastAsia="Times New Roman" w:cs="Arial"/>
           <w:lang w:eastAsia="es-SV"/>
@@ -2586,7 +2767,63 @@
     </w:p>
     <w:p>
       <w:pPr>
-        <w:pStyle w:val="Ttulo2"/>
+        <w:rPr>
+          <w:lang w:eastAsia="es-SV"/>
+        </w:rPr>
+      </w:pPr>
+    </w:p>
+    <w:p>
+      <w:pPr>
+        <w:rPr>
+          <w:rFonts w:ascii="Arial" w:eastAsia="Museo Sans 300" w:hAnsi="Arial" w:cs="Arial"/>
+        </w:rPr>
+      </w:pPr>
+      <w:r>
+        <w:rPr>
+          <w:rFonts w:ascii="Arial" w:eastAsia="Museo Sans 300" w:hAnsi="Arial" w:cs="Arial"/>
+        </w:rPr>
+        <w:t>IAM</w:t>
+      </w:r>
+    </w:p>
+    <w:p>
+      <w:pPr>
+        <w:rPr>
+          <w:rFonts w:ascii="Arial" w:eastAsia="Museo Sans 300" w:hAnsi="Arial" w:cs="Arial"/>
+        </w:rPr>
+      </w:pPr>
+    </w:p>
+    <w:p>
+      <w:pPr>
+        <w:rPr>
+          <w:rFonts w:ascii="Arial" w:eastAsia="Museo Sans 300" w:hAnsi="Arial" w:cs="Arial"/>
+        </w:rPr>
+      </w:pPr>
+      <w:r>
+        <w:rPr>
+          <w:rFonts w:ascii="Arial" w:eastAsia="Museo Sans 300" w:hAnsi="Arial" w:cs="Arial"/>
+        </w:rPr>
+        <w:t xml:space="preserve">Documento comparativo de opciones: </w:t>
+      </w:r>
+      <w:hyperlink r:id="rId8" w:history="1">
+        <w:r>
+          <w:rPr>
+            <w:rStyle w:val="Hyperlink"/>
+            <w:rFonts w:ascii="Arial" w:eastAsia="Museo Sans 300" w:hAnsi="Arial" w:cs="Arial"/>
+          </w:rPr>
+          <w:t>https://github.com/neldylilianahernandez23-collab/IAM-ZeroTrust-SN6/blob/main/01_IAM/Investigacion/Fase%200%20-%20Plan%20de%20Recursos%20Ingeniero%20IAM%20Jr.docx</w:t>
+        </w:r>
+      </w:hyperlink>
+    </w:p>
+    <w:p>
+      <w:pPr>
+        <w:rPr>
+          <w:lang w:eastAsia="es-SV"/>
+        </w:rPr>
+      </w:pPr>
+    </w:p>
+    <w:p>
+      <w:pPr>
+        <w:pStyle w:val="Heading2"/>
         <w:rPr>
           <w:rFonts w:eastAsia="Times New Roman" w:cs="Arial"/>
           <w:lang w:eastAsia="es-SV"/>
@@ -2626,6 +2863,60 @@
       <w:pPr>
         <w:rPr>
           <w:rFonts w:ascii="Arial" w:eastAsia="Museo Sans 300" w:hAnsi="Arial" w:cs="Arial"/>
+        </w:rPr>
+      </w:pPr>
+      <w:r>
+        <w:rPr>
+          <w:rFonts w:ascii="Arial" w:eastAsia="Museo Sans 300" w:hAnsi="Arial" w:cs="Arial"/>
+        </w:rPr>
+        <w:t>IAM</w:t>
+      </w:r>
+    </w:p>
+    <w:p>
+      <w:pPr>
+        <w:rPr>
+          <w:rFonts w:ascii="Arial" w:eastAsia="Museo Sans 300" w:hAnsi="Arial" w:cs="Arial"/>
+        </w:rPr>
+      </w:pPr>
+    </w:p>
+    <w:p>
+      <w:pPr>
+        <w:rPr>
+          <w:rFonts w:ascii="Arial" w:eastAsia="Museo Sans 300" w:hAnsi="Arial" w:cs="Arial"/>
+        </w:rPr>
+      </w:pPr>
+      <w:r>
+        <w:rPr>
+          <w:rFonts w:ascii="Arial" w:eastAsia="Museo Sans 300" w:hAnsi="Arial" w:cs="Arial"/>
+        </w:rPr>
+        <w:t xml:space="preserve">Para los objetivos específicos del prototipo de la Universidad Nova Digital, se concluye que Auth0 representa la alternativa con mayor viabilidad técnica y </w:t>
+      </w:r>
+      <w:r>
+        <w:rPr>
+          <w:rFonts w:ascii="Arial" w:eastAsia="Museo Sans 300" w:hAnsi="Arial" w:cs="Arial"/>
+        </w:rPr>
+        <w:lastRenderedPageBreak/>
+        <w:t xml:space="preserve">operativa. Su despliegue ágil permite mitigar de forma inmediata riesgos asociados a la autenticación débil mediante MFA nativo, permitiendo al equipo concentrar el esfuerzo de desarrollo asincrónico en la construcción del </w:t>
+      </w:r>
+      <w:proofErr w:type="spellStart"/>
+      <w:r>
+        <w:rPr>
+          <w:rFonts w:ascii="Arial" w:eastAsia="Museo Sans 300" w:hAnsi="Arial" w:cs="Arial"/>
+        </w:rPr>
+        <w:t>Backend</w:t>
+      </w:r>
+      <w:proofErr w:type="spellEnd"/>
+      <w:r>
+        <w:rPr>
+          <w:rFonts w:ascii="Arial" w:eastAsia="Museo Sans 300" w:hAnsi="Arial" w:cs="Arial"/>
+        </w:rPr>
+        <w:t xml:space="preserve"> seguro y el módulo de trazabilidad durante las fases subsecuentes del proyecto.</w:t>
+      </w:r>
+    </w:p>
+    <w:p>
+      <w:pPr>
+        <w:rPr>
+          <w:rFonts w:ascii="Arial" w:eastAsia="Museo Sans 300" w:hAnsi="Arial" w:cs="Arial"/>
           <w:color w:val="153D63" w:themeColor="text2" w:themeTint="E6"/>
           <w:sz w:val="28"/>
           <w:szCs w:val="28"/>
@@ -2644,127 +2935,7 @@
     </w:p>
     <w:p>
       <w:pPr>
-        <w:rPr>
-          <w:rFonts w:ascii="Arial" w:eastAsia="Museo Sans 300" w:hAnsi="Arial" w:cs="Arial"/>
-          <w:color w:val="153D63" w:themeColor="text2" w:themeTint="E6"/>
-          <w:sz w:val="28"/>
-          <w:szCs w:val="28"/>
-        </w:rPr>
-      </w:pPr>
-    </w:p>
-    <w:p>
-      <w:pPr>
-        <w:rPr>
-          <w:rFonts w:ascii="Arial" w:eastAsia="Museo Sans 300" w:hAnsi="Arial" w:cs="Arial"/>
-          <w:color w:val="153D63" w:themeColor="text2" w:themeTint="E6"/>
-          <w:sz w:val="28"/>
-          <w:szCs w:val="28"/>
-        </w:rPr>
-      </w:pPr>
-    </w:p>
-    <w:p>
-      <w:pPr>
-        <w:rPr>
-          <w:rFonts w:ascii="Arial" w:eastAsia="Museo Sans 300" w:hAnsi="Arial" w:cs="Arial"/>
-          <w:color w:val="153D63" w:themeColor="text2" w:themeTint="E6"/>
-          <w:sz w:val="28"/>
-          <w:szCs w:val="28"/>
-        </w:rPr>
-      </w:pPr>
-    </w:p>
-    <w:p>
-      <w:pPr>
-        <w:rPr>
-          <w:rFonts w:ascii="Arial" w:eastAsia="Museo Sans 300" w:hAnsi="Arial" w:cs="Arial"/>
-          <w:color w:val="153D63" w:themeColor="text2" w:themeTint="E6"/>
-          <w:sz w:val="28"/>
-          <w:szCs w:val="28"/>
-        </w:rPr>
-      </w:pPr>
-    </w:p>
-    <w:p>
-      <w:pPr>
-        <w:rPr>
-          <w:rFonts w:ascii="Arial" w:eastAsia="Museo Sans 300" w:hAnsi="Arial" w:cs="Arial"/>
-          <w:color w:val="153D63" w:themeColor="text2" w:themeTint="E6"/>
-          <w:sz w:val="28"/>
-          <w:szCs w:val="28"/>
-        </w:rPr>
-      </w:pPr>
-    </w:p>
-    <w:p>
-      <w:pPr>
-        <w:rPr>
-          <w:rFonts w:ascii="Arial" w:eastAsia="Museo Sans 300" w:hAnsi="Arial" w:cs="Arial"/>
-          <w:color w:val="153D63" w:themeColor="text2" w:themeTint="E6"/>
-          <w:sz w:val="28"/>
-          <w:szCs w:val="28"/>
-        </w:rPr>
-      </w:pPr>
-    </w:p>
-    <w:p>
-      <w:pPr>
-        <w:rPr>
-          <w:rFonts w:ascii="Arial" w:eastAsia="Museo Sans 300" w:hAnsi="Arial" w:cs="Arial"/>
-          <w:color w:val="153D63" w:themeColor="text2" w:themeTint="E6"/>
-          <w:sz w:val="28"/>
-          <w:szCs w:val="28"/>
-        </w:rPr>
-      </w:pPr>
-    </w:p>
-    <w:p>
-      <w:pPr>
-        <w:rPr>
-          <w:rFonts w:ascii="Arial" w:eastAsia="Museo Sans 300" w:hAnsi="Arial" w:cs="Arial"/>
-          <w:color w:val="153D63" w:themeColor="text2" w:themeTint="E6"/>
-          <w:sz w:val="28"/>
-          <w:szCs w:val="28"/>
-        </w:rPr>
-      </w:pPr>
-    </w:p>
-    <w:p>
-      <w:pPr>
-        <w:rPr>
-          <w:rFonts w:ascii="Arial" w:eastAsia="Museo Sans 300" w:hAnsi="Arial" w:cs="Arial"/>
-          <w:color w:val="153D63" w:themeColor="text2" w:themeTint="E6"/>
-          <w:sz w:val="28"/>
-          <w:szCs w:val="28"/>
-        </w:rPr>
-      </w:pPr>
-    </w:p>
-    <w:p>
-      <w:pPr>
-        <w:rPr>
-          <w:rFonts w:ascii="Arial" w:eastAsia="Museo Sans 300" w:hAnsi="Arial" w:cs="Arial"/>
-          <w:color w:val="153D63" w:themeColor="text2" w:themeTint="E6"/>
-          <w:sz w:val="28"/>
-          <w:szCs w:val="28"/>
-        </w:rPr>
-      </w:pPr>
-    </w:p>
-    <w:p>
-      <w:pPr>
-        <w:rPr>
-          <w:rFonts w:ascii="Arial" w:eastAsia="Museo Sans 300" w:hAnsi="Arial" w:cs="Arial"/>
-          <w:color w:val="153D63" w:themeColor="text2" w:themeTint="E6"/>
-          <w:sz w:val="28"/>
-          <w:szCs w:val="28"/>
-        </w:rPr>
-      </w:pPr>
-    </w:p>
-    <w:p>
-      <w:pPr>
-        <w:rPr>
-          <w:rFonts w:ascii="Arial" w:eastAsia="Museo Sans 300" w:hAnsi="Arial" w:cs="Arial"/>
-          <w:color w:val="153D63" w:themeColor="text2" w:themeTint="E6"/>
-          <w:sz w:val="28"/>
-          <w:szCs w:val="28"/>
-        </w:rPr>
-      </w:pPr>
-    </w:p>
-    <w:p>
-      <w:pPr>
-        <w:pStyle w:val="Ttulo1"/>
+        <w:pStyle w:val="Heading1"/>
         <w:rPr>
           <w:rFonts w:eastAsia="Museo Sans 300" w:cs="Arial"/>
         </w:rPr>
@@ -2774,14 +2945,13 @@
         <w:rPr>
           <w:rFonts w:eastAsia="Museo Sans 300" w:cs="Arial"/>
         </w:rPr>
-        <w:lastRenderedPageBreak/>
         <w:t>Evidencias</w:t>
       </w:r>
       <w:bookmarkEnd w:id="5"/>
     </w:p>
     <w:p>
       <w:pPr>
-        <w:pStyle w:val="Ttulo2"/>
+        <w:pStyle w:val="Heading2"/>
         <w:rPr>
           <w:rFonts w:eastAsia="Museo Sans 300" w:cs="Arial"/>
         </w:rPr>
@@ -2805,19 +2975,7 @@
         <w:rPr>
           <w:rFonts w:ascii="Arial" w:hAnsi="Arial" w:cs="Arial"/>
         </w:rPr>
-        <w:t xml:space="preserve"> La evidencia de la asignación de roles se puede visualizar en la siguiente ruta: </w:t>
-      </w:r>
-      <w:r>
-        <w:rPr>
-          <w:rFonts w:ascii="Arial" w:hAnsi="Arial" w:cs="Arial"/>
-        </w:rPr>
-        <w:t>00_Gestion_Proyecto/Documentos_a_Entregar/Roles_y_Responsabilidades_SN6.docx</w:t>
-      </w:r>
-      <w:r>
-        <w:rPr>
-          <w:rFonts w:ascii="Arial" w:hAnsi="Arial" w:cs="Arial"/>
-        </w:rPr>
-        <w:t xml:space="preserve"> </w:t>
+        <w:t xml:space="preserve"> La evidencia de la asignación de roles se puede visualizar en la siguiente ruta: 00_Gestion_Proyecto/Documentos_a_Entregar/Roles_y_Responsabilidades_SN6.docx </w:t>
       </w:r>
     </w:p>
     <w:p>
@@ -2832,10 +2990,10 @@
         </w:rPr>
         <w:t xml:space="preserve">Link: </w:t>
       </w:r>
-      <w:hyperlink r:id="rId8" w:history="1">
+      <w:hyperlink r:id="rId9" w:history="1">
         <w:r>
           <w:rPr>
-            <w:rStyle w:val="Hipervnculo"/>
+            <w:rStyle w:val="Hyperlink"/>
             <w:lang w:val="en-US"/>
           </w:rPr>
           <w:t>https://github.com/neldylilianahernandez23-collab/IAM-ZeroTrust-SN6/blob/aac941589e2116b01ba3ff2911387d2bcba09e67/00_Gestion_Proyecto/Documentos_a_Entregar/Roles_y_Responsabilidades_SN6.docx</w:t>
@@ -2857,6 +3015,9 @@
     </w:p>
     <w:p>
       <w:r>
+        <w:rPr>
+          <w:noProof/>
+        </w:rPr>
         <w:drawing>
           <wp:inline distT="0" distB="0" distL="0" distR="0" wp14:anchorId="63B75F60" wp14:editId="1C66B75B">
             <wp:extent cx="4869087" cy="2438400"/>
@@ -2873,7 +3034,7 @@
                     <pic:cNvPicPr/>
                   </pic:nvPicPr>
                   <pic:blipFill>
-                    <a:blip r:embed="rId9"/>
+                    <a:blip r:embed="rId10"/>
                     <a:stretch>
                       <a:fillRect/>
                     </a:stretch>
@@ -2897,7 +3058,7 @@
     <w:p/>
     <w:p>
       <w:pPr>
-        <w:pStyle w:val="Ttulo2"/>
+        <w:pStyle w:val="Heading2"/>
         <w:rPr>
           <w:rFonts w:eastAsia="Museo Sans 300" w:cs="Arial"/>
         </w:rPr>
@@ -2912,20 +3073,29 @@
       <w:bookmarkEnd w:id="7"/>
     </w:p>
     <w:p>
+      <w:proofErr w:type="spellStart"/>
       <w:r>
         <w:rPr>
           <w:b/>
           <w:bCs/>
         </w:rPr>
-        <w:t>Telegram:</w:t>
+        <w:t>Telegram</w:t>
+      </w:r>
+      <w:proofErr w:type="spellEnd"/>
+      <w:r>
+        <w:rPr>
+          <w:b/>
+          <w:bCs/>
+        </w:rPr>
+        <w:t>:</w:t>
       </w:r>
       <w:r>
         <w:t xml:space="preserve"> </w:t>
       </w:r>
-      <w:hyperlink r:id="rId10" w:history="1">
+      <w:hyperlink r:id="rId11" w:history="1">
         <w:r>
           <w:rPr>
-            <w:rStyle w:val="Hipervnculo"/>
+            <w:rStyle w:val="Hyperlink"/>
           </w:rPr>
           <w:t>https://t.me/+uvfqGsbAbhwwNzA5</w:t>
         </w:r>
@@ -2941,8 +3111,10 @@
       </w:pPr>
       <w:r>
         <w:rPr>
+          <w:noProof/>
           <w:lang w:val="es-419"/>
         </w:rPr>
+        <w:lastRenderedPageBreak/>
         <w:drawing>
           <wp:inline distT="0" distB="0" distL="0" distR="0" wp14:anchorId="2E190A55" wp14:editId="56A50A18">
             <wp:extent cx="4824136" cy="2962275"/>
@@ -2961,7 +3133,7 @@
                     </pic:cNvPicPr>
                   </pic:nvPicPr>
                   <pic:blipFill>
-                    <a:blip r:embed="rId11" cstate="print">
+                    <a:blip r:embed="rId12" cstate="print">
                       <a:extLst>
                         <a:ext uri="{28A0092B-C50C-407E-A947-70E740481C1C}">
                           <a14:useLocalDpi xmlns:a14="http://schemas.microsoft.com/office/drawing/2010/main" val="0"/>
@@ -3014,10 +3186,10 @@
         </w:rPr>
         <w:t xml:space="preserve"> </w:t>
       </w:r>
-      <w:hyperlink r:id="rId12" w:history="1">
+      <w:hyperlink r:id="rId13" w:history="1">
         <w:r>
           <w:rPr>
-            <w:rStyle w:val="Hipervnculo"/>
+            <w:rStyle w:val="Hyperlink"/>
             <w:lang w:val="en-US"/>
           </w:rPr>
           <w:t>https://chat.whatsapp.com/D9sAe2JKJ0x21CQ3eojFtI</w:t>
@@ -3042,6 +3214,9 @@
         <w:jc w:val="center"/>
       </w:pPr>
       <w:r>
+        <w:rPr>
+          <w:noProof/>
+        </w:rPr>
         <w:drawing>
           <wp:inline distT="0" distB="0" distL="0" distR="0" wp14:anchorId="3D6267C0" wp14:editId="4C84D0CF">
             <wp:extent cx="4880113" cy="3848100"/>
@@ -3058,7 +3233,7 @@
                     <pic:cNvPicPr/>
                   </pic:nvPicPr>
                   <pic:blipFill>
-                    <a:blip r:embed="rId13"/>
+                    <a:blip r:embed="rId14"/>
                     <a:stretch>
                       <a:fillRect/>
                     </a:stretch>
@@ -3088,12 +3263,21 @@
           <w:lang w:val="es-419"/>
         </w:rPr>
       </w:pPr>
+      <w:proofErr w:type="spellStart"/>
       <w:r>
         <w:rPr>
           <w:b/>
           <w:bCs/>
         </w:rPr>
-        <w:t>GoogleMeet:</w:t>
+        <w:t>GoogleMeet</w:t>
+      </w:r>
+      <w:proofErr w:type="spellEnd"/>
+      <w:r>
+        <w:rPr>
+          <w:b/>
+          <w:bCs/>
+        </w:rPr>
+        <w:t>:</w:t>
       </w:r>
       <w:r>
         <w:t xml:space="preserve"> </w:t>
@@ -3103,7 +3287,15 @@
           <w:rFonts w:ascii="Arial" w:hAnsi="Arial" w:cs="Arial"/>
           <w:lang w:val="es-419"/>
         </w:rPr>
-        <w:t>Este canal está destinado exclusivamente a la coordinación de reuniones de equipo, así como al seguimiento y desarrollo de la documentación y actividades técnicas asociadas al proyecto. Las reuniones se llevarán a cabo mediante enlaces generados y administrados por el líder del proyecto.</w:t>
+        <w:t xml:space="preserve">Este canal está destinado exclusivamente a la coordinación de reuniones de equipo, así como al seguimiento y desarrollo de la documentación y </w:t>
+      </w:r>
+      <w:r>
+        <w:rPr>
+          <w:rFonts w:ascii="Arial" w:hAnsi="Arial" w:cs="Arial"/>
+          <w:lang w:val="es-419"/>
+        </w:rPr>
+        <w:lastRenderedPageBreak/>
+        <w:t>actividades técnicas asociadas al proyecto. Las reuniones se llevarán a cabo mediante enlaces generados y administrados por el líder del proyecto.</w:t>
       </w:r>
     </w:p>
     <w:p>
@@ -3142,7 +3334,7 @@
                     </pic:cNvPicPr>
                   </pic:nvPicPr>
                   <pic:blipFill>
-                    <a:blip r:embed="rId14" cstate="print">
+                    <a:blip r:embed="rId15" cstate="print">
                       <a:extLst>
                         <a:ext uri="{28A0092B-C50C-407E-A947-70E740481C1C}">
                           <a14:useLocalDpi xmlns:a14="http://schemas.microsoft.com/office/drawing/2010/main" val="0"/>
@@ -3177,7 +3369,7 @@
     <w:p/>
     <w:p>
       <w:pPr>
-        <w:pStyle w:val="Ttulo2"/>
+        <w:pStyle w:val="Heading2"/>
         <w:rPr>
           <w:rFonts w:eastAsia="Museo Sans 300" w:cs="Arial"/>
         </w:rPr>
@@ -3187,7 +3379,6 @@
         <w:rPr>
           <w:rFonts w:eastAsia="Museo Sans 300" w:cs="Arial"/>
         </w:rPr>
-        <w:lastRenderedPageBreak/>
         <w:t>Captura del repositorio</w:t>
       </w:r>
       <w:bookmarkEnd w:id="8"/>
@@ -3234,6 +3425,7 @@
       </w:pPr>
       <w:r>
         <w:rPr>
+          <w:noProof/>
           <w:lang w:val="es-419"/>
         </w:rPr>
         <w:drawing>
@@ -3252,7 +3444,7 @@
                     <pic:cNvPicPr/>
                   </pic:nvPicPr>
                   <pic:blipFill>
-                    <a:blip r:embed="rId15"/>
+                    <a:blip r:embed="rId16"/>
                     <a:stretch>
                       <a:fillRect/>
                     </a:stretch>
@@ -3275,7 +3467,7 @@
     </w:p>
     <w:p>
       <w:pPr>
-        <w:pStyle w:val="Ttulo1"/>
+        <w:pStyle w:val="Heading1"/>
         <w:rPr>
           <w:rFonts w:eastAsia="Museo Sans 300" w:cs="Arial"/>
         </w:rPr>
@@ -3291,7 +3483,7 @@
     </w:p>
     <w:p>
       <w:pPr>
-        <w:pStyle w:val="Ttulo2"/>
+        <w:pStyle w:val="Heading2"/>
         <w:rPr>
           <w:rFonts w:cs="Arial"/>
         </w:rPr>
@@ -3337,7 +3529,7 @@
     </w:p>
     <w:p>
       <w:pPr>
-        <w:pStyle w:val="Ttulo2"/>
+        <w:pStyle w:val="Heading2"/>
         <w:rPr>
           <w:rFonts w:eastAsia="Museo Sans 300" w:cs="Arial"/>
         </w:rPr>
@@ -3365,7 +3557,7 @@
     </w:p>
     <w:p>
       <w:pPr>
-        <w:pStyle w:val="Prrafodelista"/>
+        <w:pStyle w:val="ListParagraph"/>
         <w:numPr>
           <w:ilvl w:val="0"/>
           <w:numId w:val="11"/>
@@ -3383,7 +3575,7 @@
     </w:p>
     <w:p>
       <w:pPr>
-        <w:pStyle w:val="Prrafodelista"/>
+        <w:pStyle w:val="ListParagraph"/>
         <w:numPr>
           <w:ilvl w:val="0"/>
           <w:numId w:val="11"/>
@@ -3401,7 +3593,7 @@
     </w:p>
     <w:p>
       <w:pPr>
-        <w:pStyle w:val="Prrafodelista"/>
+        <w:pStyle w:val="ListParagraph"/>
         <w:numPr>
           <w:ilvl w:val="0"/>
           <w:numId w:val="11"/>
@@ -3419,7 +3611,7 @@
     </w:p>
     <w:p>
       <w:pPr>
-        <w:pStyle w:val="Prrafodelista"/>
+        <w:pStyle w:val="ListParagraph"/>
         <w:numPr>
           <w:ilvl w:val="0"/>
           <w:numId w:val="11"/>
@@ -3437,7 +3629,7 @@
     </w:p>
     <w:p>
       <w:pPr>
-        <w:pStyle w:val="Prrafodelista"/>
+        <w:pStyle w:val="ListParagraph"/>
         <w:numPr>
           <w:ilvl w:val="0"/>
           <w:numId w:val="11"/>
@@ -3464,12 +3656,12 @@
       </w:pPr>
     </w:p>
     <w:sectPr>
-      <w:headerReference w:type="even" r:id="rId16"/>
-      <w:headerReference w:type="default" r:id="rId17"/>
-      <w:footerReference w:type="even" r:id="rId18"/>
-      <w:footerReference w:type="default" r:id="rId19"/>
-      <w:headerReference w:type="first" r:id="rId20"/>
-      <w:footerReference w:type="first" r:id="rId21"/>
+      <w:headerReference w:type="even" r:id="rId17"/>
+      <w:headerReference w:type="default" r:id="rId18"/>
+      <w:footerReference w:type="even" r:id="rId19"/>
+      <w:footerReference w:type="default" r:id="rId20"/>
+      <w:headerReference w:type="first" r:id="rId21"/>
+      <w:footerReference w:type="first" r:id="rId22"/>
       <w:pgSz w:w="12240" w:h="15840"/>
       <w:pgMar w:top="1417" w:right="1701" w:bottom="1417" w:left="1701" w:header="708" w:footer="708" w:gutter="0"/>
       <w:cols w:space="708"/>
@@ -3502,7 +3694,7 @@
 <w:ftr xmlns:wpc="http://schemas.microsoft.com/office/word/2010/wordprocessingCanvas" xmlns:cx="http://schemas.microsoft.com/office/drawing/2014/chartex" xmlns:cx1="http://schemas.microsoft.com/office/drawing/2015/9/8/chartex" xmlns:cx2="http://schemas.microsoft.com/office/drawing/2015/10/21/chartex" xmlns:cx3="http://schemas.microsoft.com/office/drawing/2016/5/9/chartex" xmlns:cx4="http://schemas.microsoft.com/office/drawing/2016/5/10/chartex" xmlns:cx5="http://schemas.microsoft.com/office/drawing/2016/5/11/chartex" xmlns:cx6="http://schemas.microsoft.com/office/drawing/2016/5/12/chartex" xmlns:cx7="http://schemas.microsoft.com/office/drawing/2016/5/13/chartex" xmlns:cx8="http://schemas.microsoft.com/office/drawing/2016/5/14/chartex" xmlns:mc="http://schemas.openxmlformats.org/markup-compatibility/2006" xmlns:aink="http://schemas.microsoft.com/office/drawing/2016/ink" xmlns:am3d="http://schemas.microsoft.com/office/drawing/2017/model3d" xmlns:o="urn:schemas-microsoft-com:office:office" xmlns:oel="http://schemas.microsoft.com/office/2019/extlst" xmlns:r="http://schemas.openxmlformats.org/officeDocument/2006/relationships" xmlns:m="http://schemas.openxmlformats.org/officeDocument/2006/math" xmlns:v="urn:schemas-microsoft-com:vml" xmlns:wp14="http://schemas.microsoft.com/office/word/2010/wordprocessingDrawing" xmlns:wp="http://schemas.openxmlformats.org/drawingml/2006/wordprocessingDrawing" xmlns:w10="urn:schemas-microsoft-com:office:word" xmlns:w="http://schemas.openxmlformats.org/wordprocessingml/2006/main" xmlns:w14="http://schemas.microsoft.com/office/word/2010/wordml" xmlns:w15="http://schemas.microsoft.com/office/word/2012/wordml" xmlns:w16cex="http://schemas.microsoft.com/office/word/2018/wordml/cex" xmlns:w16cid="http://schemas.microsoft.com/office/word/2016/wordml/cid" xmlns:w16="http://schemas.microsoft.com/office/word/2018/wordml" xmlns:w16du="http://schemas.microsoft.com/office/word/2023/wordml/word16du" xmlns:w16sdtdh="http://schemas.microsoft.com/office/word/2020/wordml/sdtdatahash" xmlns:w16sdtfl="http://schemas.microsoft.com/office/word/2024/wordml/sdtformatlock" xmlns:w16se="http://schemas.microsoft.com/office/word/2015/wordml/symex" xmlns:wpg="http://schemas.microsoft.com/office/word/2010/wordprocessingGroup" xmlns:wpi="http://schemas.microsoft.com/office/word/2010/wordprocessingInk" xmlns:wne="http://schemas.microsoft.com/office/word/2006/wordml" xmlns:wps="http://schemas.microsoft.com/office/word/2010/wordprocessingShape" mc:Ignorable="w14 w15 w16se w16cid w16 w16cex w16sdtdh w16sdtfl w16du wp14">
   <w:p>
     <w:pPr>
-      <w:pStyle w:val="Piedepgina"/>
+      <w:pStyle w:val="Footer"/>
     </w:pPr>
   </w:p>
 </w:ftr>
@@ -3512,7 +3704,7 @@
 <w:ftr xmlns:wpc="http://schemas.microsoft.com/office/word/2010/wordprocessingCanvas" xmlns:cx="http://schemas.microsoft.com/office/drawing/2014/chartex" xmlns:cx1="http://schemas.microsoft.com/office/drawing/2015/9/8/chartex" xmlns:cx2="http://schemas.microsoft.com/office/drawing/2015/10/21/chartex" xmlns:cx3="http://schemas.microsoft.com/office/drawing/2016/5/9/chartex" xmlns:cx4="http://schemas.microsoft.com/office/drawing/2016/5/10/chartex" xmlns:cx5="http://schemas.microsoft.com/office/drawing/2016/5/11/chartex" xmlns:cx6="http://schemas.microsoft.com/office/drawing/2016/5/12/chartex" xmlns:cx7="http://schemas.microsoft.com/office/drawing/2016/5/13/chartex" xmlns:cx8="http://schemas.microsoft.com/office/drawing/2016/5/14/chartex" xmlns:mc="http://schemas.openxmlformats.org/markup-compatibility/2006" xmlns:aink="http://schemas.microsoft.com/office/drawing/2016/ink" xmlns:am3d="http://schemas.microsoft.com/office/drawing/2017/model3d" xmlns:o="urn:schemas-microsoft-com:office:office" xmlns:oel="http://schemas.microsoft.com/office/2019/extlst" xmlns:r="http://schemas.openxmlformats.org/officeDocument/2006/relationships" xmlns:m="http://schemas.openxmlformats.org/officeDocument/2006/math" xmlns:v="urn:schemas-microsoft-com:vml" xmlns:wp14="http://schemas.microsoft.com/office/word/2010/wordprocessingDrawing" xmlns:wp="http://schemas.openxmlformats.org/drawingml/2006/wordprocessingDrawing" xmlns:w10="urn:schemas-microsoft-com:office:word" xmlns:w="http://schemas.openxmlformats.org/wordprocessingml/2006/main" xmlns:w14="http://schemas.microsoft.com/office/word/2010/wordml" xmlns:w15="http://schemas.microsoft.com/office/word/2012/wordml" xmlns:w16cex="http://schemas.microsoft.com/office/word/2018/wordml/cex" xmlns:w16cid="http://schemas.microsoft.com/office/word/2016/wordml/cid" xmlns:w16="http://schemas.microsoft.com/office/word/2018/wordml" xmlns:w16du="http://schemas.microsoft.com/office/word/2023/wordml/word16du" xmlns:w16sdtdh="http://schemas.microsoft.com/office/word/2020/wordml/sdtdatahash" xmlns:w16sdtfl="http://schemas.microsoft.com/office/word/2024/wordml/sdtformatlock" xmlns:w16se="http://schemas.microsoft.com/office/word/2015/wordml/symex" xmlns:wpg="http://schemas.microsoft.com/office/word/2010/wordprocessingGroup" xmlns:wpi="http://schemas.microsoft.com/office/word/2010/wordprocessingInk" xmlns:wne="http://schemas.microsoft.com/office/word/2006/wordml" xmlns:wps="http://schemas.microsoft.com/office/word/2010/wordprocessingShape" mc:Ignorable="w14 w15 w16se w16cid w16 w16cex w16sdtdh w16sdtfl w16du wp14">
   <w:p>
     <w:pPr>
-      <w:pStyle w:val="Piedepgina"/>
+      <w:pStyle w:val="Footer"/>
     </w:pPr>
   </w:p>
 </w:ftr>
@@ -3522,7 +3714,7 @@
 <w:ftr xmlns:wpc="http://schemas.microsoft.com/office/word/2010/wordprocessingCanvas" xmlns:cx="http://schemas.microsoft.com/office/drawing/2014/chartex" xmlns:cx1="http://schemas.microsoft.com/office/drawing/2015/9/8/chartex" xmlns:cx2="http://schemas.microsoft.com/office/drawing/2015/10/21/chartex" xmlns:cx3="http://schemas.microsoft.com/office/drawing/2016/5/9/chartex" xmlns:cx4="http://schemas.microsoft.com/office/drawing/2016/5/10/chartex" xmlns:cx5="http://schemas.microsoft.com/office/drawing/2016/5/11/chartex" xmlns:cx6="http://schemas.microsoft.com/office/drawing/2016/5/12/chartex" xmlns:cx7="http://schemas.microsoft.com/office/drawing/2016/5/13/chartex" xmlns:cx8="http://schemas.microsoft.com/office/drawing/2016/5/14/chartex" xmlns:mc="http://schemas.openxmlformats.org/markup-compatibility/2006" xmlns:aink="http://schemas.microsoft.com/office/drawing/2016/ink" xmlns:am3d="http://schemas.microsoft.com/office/drawing/2017/model3d" xmlns:o="urn:schemas-microsoft-com:office:office" xmlns:oel="http://schemas.microsoft.com/office/2019/extlst" xmlns:r="http://schemas.openxmlformats.org/officeDocument/2006/relationships" xmlns:m="http://schemas.openxmlformats.org/officeDocument/2006/math" xmlns:v="urn:schemas-microsoft-com:vml" xmlns:wp14="http://schemas.microsoft.com/office/word/2010/wordprocessingDrawing" xmlns:wp="http://schemas.openxmlformats.org/drawingml/2006/wordprocessingDrawing" xmlns:w10="urn:schemas-microsoft-com:office:word" xmlns:w="http://schemas.openxmlformats.org/wordprocessingml/2006/main" xmlns:w14="http://schemas.microsoft.com/office/word/2010/wordml" xmlns:w15="http://schemas.microsoft.com/office/word/2012/wordml" xmlns:w16cex="http://schemas.microsoft.com/office/word/2018/wordml/cex" xmlns:w16cid="http://schemas.microsoft.com/office/word/2016/wordml/cid" xmlns:w16="http://schemas.microsoft.com/office/word/2018/wordml" xmlns:w16du="http://schemas.microsoft.com/office/word/2023/wordml/word16du" xmlns:w16sdtdh="http://schemas.microsoft.com/office/word/2020/wordml/sdtdatahash" xmlns:w16sdtfl="http://schemas.microsoft.com/office/word/2024/wordml/sdtformatlock" xmlns:w16se="http://schemas.microsoft.com/office/word/2015/wordml/symex" xmlns:wpg="http://schemas.microsoft.com/office/word/2010/wordprocessingGroup" xmlns:wpi="http://schemas.microsoft.com/office/word/2010/wordprocessingInk" xmlns:wne="http://schemas.microsoft.com/office/word/2006/wordml" xmlns:wps="http://schemas.microsoft.com/office/word/2010/wordprocessingShape" mc:Ignorable="w14 w15 w16se w16cid w16 w16cex w16sdtdh w16sdtfl w16du wp14">
   <w:p>
     <w:pPr>
-      <w:pStyle w:val="Piedepgina"/>
+      <w:pStyle w:val="Footer"/>
     </w:pPr>
   </w:p>
 </w:ftr>
@@ -3551,7 +3743,7 @@
 <w:hdr xmlns:wpc="http://schemas.microsoft.com/office/word/2010/wordprocessingCanvas" xmlns:cx="http://schemas.microsoft.com/office/drawing/2014/chartex" xmlns:cx1="http://schemas.microsoft.com/office/drawing/2015/9/8/chartex" xmlns:cx2="http://schemas.microsoft.com/office/drawing/2015/10/21/chartex" xmlns:cx3="http://schemas.microsoft.com/office/drawing/2016/5/9/chartex" xmlns:cx4="http://schemas.microsoft.com/office/drawing/2016/5/10/chartex" xmlns:cx5="http://schemas.microsoft.com/office/drawing/2016/5/11/chartex" xmlns:cx6="http://schemas.microsoft.com/office/drawing/2016/5/12/chartex" xmlns:cx7="http://schemas.microsoft.com/office/drawing/2016/5/13/chartex" xmlns:cx8="http://schemas.microsoft.com/office/drawing/2016/5/14/chartex" xmlns:mc="http://schemas.openxmlformats.org/markup-compatibility/2006" xmlns:aink="http://schemas.microsoft.com/office/drawing/2016/ink" xmlns:am3d="http://schemas.microsoft.com/office/drawing/2017/model3d" xmlns:o="urn:schemas-microsoft-com:office:office" xmlns:oel="http://schemas.microsoft.com/office/2019/extlst" xmlns:r="http://schemas.openxmlformats.org/officeDocument/2006/relationships" xmlns:m="http://schemas.openxmlformats.org/officeDocument/2006/math" xmlns:v="urn:schemas-microsoft-com:vml" xmlns:wp14="http://schemas.microsoft.com/office/word/2010/wordprocessingDrawing" xmlns:wp="http://schemas.openxmlformats.org/drawingml/2006/wordprocessingDrawing" xmlns:w10="urn:schemas-microsoft-com:office:word" xmlns:w="http://schemas.openxmlformats.org/wordprocessingml/2006/main" xmlns:w14="http://schemas.microsoft.com/office/word/2010/wordml" xmlns:w15="http://schemas.microsoft.com/office/word/2012/wordml" xmlns:w16cex="http://schemas.microsoft.com/office/word/2018/wordml/cex" xmlns:w16cid="http://schemas.microsoft.com/office/word/2016/wordml/cid" xmlns:w16="http://schemas.microsoft.com/office/word/2018/wordml" xmlns:w16du="http://schemas.microsoft.com/office/word/2023/wordml/word16du" xmlns:w16sdtdh="http://schemas.microsoft.com/office/word/2020/wordml/sdtdatahash" xmlns:w16sdtfl="http://schemas.microsoft.com/office/word/2024/wordml/sdtformatlock" xmlns:w16se="http://schemas.microsoft.com/office/word/2015/wordml/symex" xmlns:wpg="http://schemas.microsoft.com/office/word/2010/wordprocessingGroup" xmlns:wpi="http://schemas.microsoft.com/office/word/2010/wordprocessingInk" xmlns:wne="http://schemas.microsoft.com/office/word/2006/wordml" xmlns:wps="http://schemas.microsoft.com/office/word/2010/wordprocessingShape" mc:Ignorable="w14 w15 w16se w16cid w16 w16cex w16sdtdh w16sdtfl w16du wp14">
   <w:p>
     <w:pPr>
-      <w:pStyle w:val="Encabezado"/>
+      <w:pStyle w:val="Header"/>
     </w:pPr>
   </w:p>
 </w:hdr>
@@ -3561,7 +3753,7 @@
 <w:hdr xmlns:wpc="http://schemas.microsoft.com/office/word/2010/wordprocessingCanvas" xmlns:cx="http://schemas.microsoft.com/office/drawing/2014/chartex" xmlns:cx1="http://schemas.microsoft.com/office/drawing/2015/9/8/chartex" xmlns:cx2="http://schemas.microsoft.com/office/drawing/2015/10/21/chartex" xmlns:cx3="http://schemas.microsoft.com/office/drawing/2016/5/9/chartex" xmlns:cx4="http://schemas.microsoft.com/office/drawing/2016/5/10/chartex" xmlns:cx5="http://schemas.microsoft.com/office/drawing/2016/5/11/chartex" xmlns:cx6="http://schemas.microsoft.com/office/drawing/2016/5/12/chartex" xmlns:cx7="http://schemas.microsoft.com/office/drawing/2016/5/13/chartex" xmlns:cx8="http://schemas.microsoft.com/office/drawing/2016/5/14/chartex" xmlns:mc="http://schemas.openxmlformats.org/markup-compatibility/2006" xmlns:aink="http://schemas.microsoft.com/office/drawing/2016/ink" xmlns:am3d="http://schemas.microsoft.com/office/drawing/2017/model3d" xmlns:o="urn:schemas-microsoft-com:office:office" xmlns:oel="http://schemas.microsoft.com/office/2019/extlst" xmlns:r="http://schemas.openxmlformats.org/officeDocument/2006/relationships" xmlns:m="http://schemas.openxmlformats.org/officeDocument/2006/math" xmlns:v="urn:schemas-microsoft-com:vml" xmlns:wp14="http://schemas.microsoft.com/office/word/2010/wordprocessingDrawing" xmlns:wp="http://schemas.openxmlformats.org/drawingml/2006/wordprocessingDrawing" xmlns:w10="urn:schemas-microsoft-com:office:word" xmlns:w="http://schemas.openxmlformats.org/wordprocessingml/2006/main" xmlns:w14="http://schemas.microsoft.com/office/word/2010/wordml" xmlns:w15="http://schemas.microsoft.com/office/word/2012/wordml" xmlns:w16cex="http://schemas.microsoft.com/office/word/2018/wordml/cex" xmlns:w16cid="http://schemas.microsoft.com/office/word/2016/wordml/cid" xmlns:w16="http://schemas.microsoft.com/office/word/2018/wordml" xmlns:w16du="http://schemas.microsoft.com/office/word/2023/wordml/word16du" xmlns:w16sdtdh="http://schemas.microsoft.com/office/word/2020/wordml/sdtdatahash" xmlns:w16sdtfl="http://schemas.microsoft.com/office/word/2024/wordml/sdtformatlock" xmlns:w16se="http://schemas.microsoft.com/office/word/2015/wordml/symex" xmlns:wpg="http://schemas.microsoft.com/office/word/2010/wordprocessingGroup" xmlns:wpi="http://schemas.microsoft.com/office/word/2010/wordprocessingInk" xmlns:wne="http://schemas.microsoft.com/office/word/2006/wordml" xmlns:wps="http://schemas.microsoft.com/office/word/2010/wordprocessingShape" mc:Ignorable="w14 w15 w16se w16cid w16 w16cex w16sdtdh w16sdtfl w16du wp14">
   <w:p>
     <w:pPr>
-      <w:pStyle w:val="Encabezado"/>
+      <w:pStyle w:val="Header"/>
       <w:tabs>
         <w:tab w:val="clear" w:pos="4419"/>
         <w:tab w:val="clear" w:pos="8838"/>
@@ -3639,7 +3831,7 @@
 <w:hdr xmlns:wpc="http://schemas.microsoft.com/office/word/2010/wordprocessingCanvas" xmlns:cx="http://schemas.microsoft.com/office/drawing/2014/chartex" xmlns:cx1="http://schemas.microsoft.com/office/drawing/2015/9/8/chartex" xmlns:cx2="http://schemas.microsoft.com/office/drawing/2015/10/21/chartex" xmlns:cx3="http://schemas.microsoft.com/office/drawing/2016/5/9/chartex" xmlns:cx4="http://schemas.microsoft.com/office/drawing/2016/5/10/chartex" xmlns:cx5="http://schemas.microsoft.com/office/drawing/2016/5/11/chartex" xmlns:cx6="http://schemas.microsoft.com/office/drawing/2016/5/12/chartex" xmlns:cx7="http://schemas.microsoft.com/office/drawing/2016/5/13/chartex" xmlns:cx8="http://schemas.microsoft.com/office/drawing/2016/5/14/chartex" xmlns:mc="http://schemas.openxmlformats.org/markup-compatibility/2006" xmlns:aink="http://schemas.microsoft.com/office/drawing/2016/ink" xmlns:am3d="http://schemas.microsoft.com/office/drawing/2017/model3d" xmlns:o="urn:schemas-microsoft-com:office:office" xmlns:oel="http://schemas.microsoft.com/office/2019/extlst" xmlns:r="http://schemas.openxmlformats.org/officeDocument/2006/relationships" xmlns:m="http://schemas.openxmlformats.org/officeDocument/2006/math" xmlns:v="urn:schemas-microsoft-com:vml" xmlns:wp14="http://schemas.microsoft.com/office/word/2010/wordprocessingDrawing" xmlns:wp="http://schemas.openxmlformats.org/drawingml/2006/wordprocessingDrawing" xmlns:w10="urn:schemas-microsoft-com:office:word" xmlns:w="http://schemas.openxmlformats.org/wordprocessingml/2006/main" xmlns:w14="http://schemas.microsoft.com/office/word/2010/wordml" xmlns:w15="http://schemas.microsoft.com/office/word/2012/wordml" xmlns:w16cex="http://schemas.microsoft.com/office/word/2018/wordml/cex" xmlns:w16cid="http://schemas.microsoft.com/office/word/2016/wordml/cid" xmlns:w16="http://schemas.microsoft.com/office/word/2018/wordml" xmlns:w16du="http://schemas.microsoft.com/office/word/2023/wordml/word16du" xmlns:w16sdtdh="http://schemas.microsoft.com/office/word/2020/wordml/sdtdatahash" xmlns:w16sdtfl="http://schemas.microsoft.com/office/word/2024/wordml/sdtformatlock" xmlns:w16se="http://schemas.microsoft.com/office/word/2015/wordml/symex" xmlns:wpg="http://schemas.microsoft.com/office/word/2010/wordprocessingGroup" xmlns:wpi="http://schemas.microsoft.com/office/word/2010/wordprocessingInk" xmlns:wne="http://schemas.microsoft.com/office/word/2006/wordml" xmlns:wps="http://schemas.microsoft.com/office/word/2010/wordprocessingShape" mc:Ignorable="w14 w15 w16se w16cid w16 w16cex w16sdtdh w16sdtfl w16du wp14">
   <w:p>
     <w:pPr>
-      <w:pStyle w:val="Encabezado"/>
+      <w:pStyle w:val="Header"/>
     </w:pPr>
   </w:p>
 </w:hdr>
@@ -5732,11 +5924,11 @@
     <w:name w:val="Normal"/>
     <w:qFormat/>
   </w:style>
-  <w:style w:type="paragraph" w:styleId="Ttulo1">
+  <w:style w:type="paragraph" w:styleId="Heading1">
     <w:name w:val="heading 1"/>
     <w:basedOn w:val="Normal"/>
     <w:next w:val="Normal"/>
-    <w:link w:val="Ttulo1Car"/>
+    <w:link w:val="Heading1Char"/>
     <w:uiPriority w:val="9"/>
     <w:qFormat/>
     <w:rsid w:val="00E32A7A"/>
@@ -5754,11 +5946,11 @@
       <w:szCs w:val="40"/>
     </w:rPr>
   </w:style>
-  <w:style w:type="paragraph" w:styleId="Ttulo2">
+  <w:style w:type="paragraph" w:styleId="Heading2">
     <w:name w:val="heading 2"/>
     <w:basedOn w:val="Normal"/>
     <w:next w:val="Normal"/>
-    <w:link w:val="Ttulo2Car"/>
+    <w:link w:val="Heading2Char"/>
     <w:uiPriority w:val="9"/>
     <w:unhideWhenUsed/>
     <w:qFormat/>
@@ -5775,11 +5967,11 @@
       <w:szCs w:val="32"/>
     </w:rPr>
   </w:style>
-  <w:style w:type="paragraph" w:styleId="Ttulo3">
+  <w:style w:type="paragraph" w:styleId="Heading3">
     <w:name w:val="heading 3"/>
     <w:basedOn w:val="Normal"/>
     <w:next w:val="Normal"/>
-    <w:link w:val="Ttulo3Car"/>
+    <w:link w:val="Heading3Char"/>
     <w:uiPriority w:val="9"/>
     <w:semiHidden/>
     <w:unhideWhenUsed/>
@@ -5798,11 +5990,11 @@
       <w:szCs w:val="28"/>
     </w:rPr>
   </w:style>
-  <w:style w:type="paragraph" w:styleId="Ttulo4">
+  <w:style w:type="paragraph" w:styleId="Heading4">
     <w:name w:val="heading 4"/>
     <w:basedOn w:val="Normal"/>
     <w:next w:val="Normal"/>
-    <w:link w:val="Ttulo4Car"/>
+    <w:link w:val="Heading4Char"/>
     <w:uiPriority w:val="9"/>
     <w:semiHidden/>
     <w:unhideWhenUsed/>
@@ -5821,11 +6013,11 @@
       <w:color w:val="0F4761" w:themeColor="accent1" w:themeShade="BF"/>
     </w:rPr>
   </w:style>
-  <w:style w:type="paragraph" w:styleId="Ttulo5">
+  <w:style w:type="paragraph" w:styleId="Heading5">
     <w:name w:val="heading 5"/>
     <w:basedOn w:val="Normal"/>
     <w:next w:val="Normal"/>
-    <w:link w:val="Ttulo5Car"/>
+    <w:link w:val="Heading5Char"/>
     <w:uiPriority w:val="9"/>
     <w:semiHidden/>
     <w:unhideWhenUsed/>
@@ -5842,11 +6034,11 @@
       <w:color w:val="0F4761" w:themeColor="accent1" w:themeShade="BF"/>
     </w:rPr>
   </w:style>
-  <w:style w:type="paragraph" w:styleId="Ttulo6">
+  <w:style w:type="paragraph" w:styleId="Heading6">
     <w:name w:val="heading 6"/>
     <w:basedOn w:val="Normal"/>
     <w:next w:val="Normal"/>
-    <w:link w:val="Ttulo6Car"/>
+    <w:link w:val="Heading6Char"/>
     <w:uiPriority w:val="9"/>
     <w:semiHidden/>
     <w:unhideWhenUsed/>
@@ -5865,11 +6057,11 @@
       <w:color w:val="595959" w:themeColor="text1" w:themeTint="A6"/>
     </w:rPr>
   </w:style>
-  <w:style w:type="paragraph" w:styleId="Ttulo7">
+  <w:style w:type="paragraph" w:styleId="Heading7">
     <w:name w:val="heading 7"/>
     <w:basedOn w:val="Normal"/>
     <w:next w:val="Normal"/>
-    <w:link w:val="Ttulo7Car"/>
+    <w:link w:val="Heading7Char"/>
     <w:uiPriority w:val="9"/>
     <w:semiHidden/>
     <w:unhideWhenUsed/>
@@ -5886,11 +6078,11 @@
       <w:color w:val="595959" w:themeColor="text1" w:themeTint="A6"/>
     </w:rPr>
   </w:style>
-  <w:style w:type="paragraph" w:styleId="Ttulo8">
+  <w:style w:type="paragraph" w:styleId="Heading8">
     <w:name w:val="heading 8"/>
     <w:basedOn w:val="Normal"/>
     <w:next w:val="Normal"/>
-    <w:link w:val="Ttulo8Car"/>
+    <w:link w:val="Heading8Char"/>
     <w:uiPriority w:val="9"/>
     <w:semiHidden/>
     <w:unhideWhenUsed/>
@@ -5908,11 +6100,11 @@
       <w:color w:val="272727" w:themeColor="text1" w:themeTint="D8"/>
     </w:rPr>
   </w:style>
-  <w:style w:type="paragraph" w:styleId="Ttulo9">
+  <w:style w:type="paragraph" w:styleId="Heading9">
     <w:name w:val="heading 9"/>
     <w:basedOn w:val="Normal"/>
     <w:next w:val="Normal"/>
-    <w:link w:val="Ttulo9Car"/>
+    <w:link w:val="Heading9Char"/>
     <w:uiPriority w:val="9"/>
     <w:semiHidden/>
     <w:unhideWhenUsed/>
@@ -5928,12 +6120,12 @@
       <w:color w:val="272727" w:themeColor="text1" w:themeTint="D8"/>
     </w:rPr>
   </w:style>
-  <w:style w:type="character" w:default="1" w:styleId="Fuentedeprrafopredeter">
+  <w:style w:type="character" w:default="1" w:styleId="DefaultParagraphFont">
     <w:name w:val="Default Paragraph Font"/>
     <w:uiPriority w:val="1"/>
     <w:unhideWhenUsed/>
   </w:style>
-  <w:style w:type="table" w:default="1" w:styleId="Tablanormal">
+  <w:style w:type="table" w:default="1" w:styleId="TableNormal">
     <w:name w:val="Normal Table"/>
     <w:uiPriority w:val="99"/>
     <w:semiHidden/>
@@ -5948,7 +6140,7 @@
       </w:tblCellMar>
     </w:tblPr>
   </w:style>
-  <w:style w:type="numbering" w:default="1" w:styleId="Sinlista">
+  <w:style w:type="numbering" w:default="1" w:styleId="NoList">
     <w:name w:val="No List"/>
     <w:uiPriority w:val="99"/>
     <w:semiHidden/>
@@ -5964,10 +6156,10 @@
       </w:numPr>
     </w:pPr>
   </w:style>
-  <w:style w:type="character" w:customStyle="1" w:styleId="Ttulo1Car">
-    <w:name w:val="Título 1 Car"/>
-    <w:basedOn w:val="Fuentedeprrafopredeter"/>
-    <w:link w:val="Ttulo1"/>
+  <w:style w:type="character" w:customStyle="1" w:styleId="Heading1Char">
+    <w:name w:val="Heading 1 Char"/>
+    <w:basedOn w:val="DefaultParagraphFont"/>
+    <w:link w:val="Heading1"/>
     <w:uiPriority w:val="9"/>
     <w:rsid w:val="00E32A7A"/>
     <w:rPr>
@@ -5978,10 +6170,10 @@
       <w:szCs w:val="40"/>
     </w:rPr>
   </w:style>
-  <w:style w:type="character" w:customStyle="1" w:styleId="Ttulo2Car">
-    <w:name w:val="Título 2 Car"/>
-    <w:basedOn w:val="Fuentedeprrafopredeter"/>
-    <w:link w:val="Ttulo2"/>
+  <w:style w:type="character" w:customStyle="1" w:styleId="Heading2Char">
+    <w:name w:val="Heading 2 Char"/>
+    <w:basedOn w:val="DefaultParagraphFont"/>
+    <w:link w:val="Heading2"/>
     <w:uiPriority w:val="9"/>
     <w:rsid w:val="00E32A7A"/>
     <w:rPr>
@@ -5990,10 +6182,10 @@
       <w:szCs w:val="32"/>
     </w:rPr>
   </w:style>
-  <w:style w:type="character" w:customStyle="1" w:styleId="Ttulo3Car">
-    <w:name w:val="Título 3 Car"/>
-    <w:basedOn w:val="Fuentedeprrafopredeter"/>
-    <w:link w:val="Ttulo3"/>
+  <w:style w:type="character" w:customStyle="1" w:styleId="Heading3Char">
+    <w:name w:val="Heading 3 Char"/>
+    <w:basedOn w:val="DefaultParagraphFont"/>
+    <w:link w:val="Heading3"/>
     <w:uiPriority w:val="9"/>
     <w:semiHidden/>
     <w:rsid w:val="00C47B31"/>
@@ -6004,10 +6196,10 @@
       <w:szCs w:val="28"/>
     </w:rPr>
   </w:style>
-  <w:style w:type="character" w:customStyle="1" w:styleId="Ttulo4Car">
-    <w:name w:val="Título 4 Car"/>
-    <w:basedOn w:val="Fuentedeprrafopredeter"/>
-    <w:link w:val="Ttulo4"/>
+  <w:style w:type="character" w:customStyle="1" w:styleId="Heading4Char">
+    <w:name w:val="Heading 4 Char"/>
+    <w:basedOn w:val="DefaultParagraphFont"/>
+    <w:link w:val="Heading4"/>
     <w:uiPriority w:val="9"/>
     <w:semiHidden/>
     <w:rsid w:val="00C47B31"/>
@@ -6018,10 +6210,10 @@
       <w:color w:val="0F4761" w:themeColor="accent1" w:themeShade="BF"/>
     </w:rPr>
   </w:style>
-  <w:style w:type="character" w:customStyle="1" w:styleId="Ttulo5Car">
-    <w:name w:val="Título 5 Car"/>
-    <w:basedOn w:val="Fuentedeprrafopredeter"/>
-    <w:link w:val="Ttulo5"/>
+  <w:style w:type="character" w:customStyle="1" w:styleId="Heading5Char">
+    <w:name w:val="Heading 5 Char"/>
+    <w:basedOn w:val="DefaultParagraphFont"/>
+    <w:link w:val="Heading5"/>
     <w:uiPriority w:val="9"/>
     <w:semiHidden/>
     <w:rsid w:val="00C47B31"/>
@@ -6030,10 +6222,10 @@
       <w:color w:val="0F4761" w:themeColor="accent1" w:themeShade="BF"/>
     </w:rPr>
   </w:style>
-  <w:style w:type="character" w:customStyle="1" w:styleId="Ttulo6Car">
-    <w:name w:val="Título 6 Car"/>
-    <w:basedOn w:val="Fuentedeprrafopredeter"/>
-    <w:link w:val="Ttulo6"/>
+  <w:style w:type="character" w:customStyle="1" w:styleId="Heading6Char">
+    <w:name w:val="Heading 6 Char"/>
+    <w:basedOn w:val="DefaultParagraphFont"/>
+    <w:link w:val="Heading6"/>
     <w:uiPriority w:val="9"/>
     <w:semiHidden/>
     <w:rsid w:val="00C47B31"/>
@@ -6044,10 +6236,10 @@
       <w:color w:val="595959" w:themeColor="text1" w:themeTint="A6"/>
     </w:rPr>
   </w:style>
-  <w:style w:type="character" w:customStyle="1" w:styleId="Ttulo7Car">
-    <w:name w:val="Título 7 Car"/>
-    <w:basedOn w:val="Fuentedeprrafopredeter"/>
-    <w:link w:val="Ttulo7"/>
+  <w:style w:type="character" w:customStyle="1" w:styleId="Heading7Char">
+    <w:name w:val="Heading 7 Char"/>
+    <w:basedOn w:val="DefaultParagraphFont"/>
+    <w:link w:val="Heading7"/>
     <w:uiPriority w:val="9"/>
     <w:semiHidden/>
     <w:rsid w:val="00C47B31"/>
@@ -6056,10 +6248,10 @@
       <w:color w:val="595959" w:themeColor="text1" w:themeTint="A6"/>
     </w:rPr>
   </w:style>
-  <w:style w:type="character" w:customStyle="1" w:styleId="Ttulo8Car">
-    <w:name w:val="Título 8 Car"/>
-    <w:basedOn w:val="Fuentedeprrafopredeter"/>
-    <w:link w:val="Ttulo8"/>
+  <w:style w:type="character" w:customStyle="1" w:styleId="Heading8Char">
+    <w:name w:val="Heading 8 Char"/>
+    <w:basedOn w:val="DefaultParagraphFont"/>
+    <w:link w:val="Heading8"/>
     <w:uiPriority w:val="9"/>
     <w:semiHidden/>
     <w:rsid w:val="00C47B31"/>
@@ -6070,10 +6262,10 @@
       <w:color w:val="272727" w:themeColor="text1" w:themeTint="D8"/>
     </w:rPr>
   </w:style>
-  <w:style w:type="character" w:customStyle="1" w:styleId="Ttulo9Car">
-    <w:name w:val="Título 9 Car"/>
-    <w:basedOn w:val="Fuentedeprrafopredeter"/>
-    <w:link w:val="Ttulo9"/>
+  <w:style w:type="character" w:customStyle="1" w:styleId="Heading9Char">
+    <w:name w:val="Heading 9 Char"/>
+    <w:basedOn w:val="DefaultParagraphFont"/>
+    <w:link w:val="Heading9"/>
     <w:uiPriority w:val="9"/>
     <w:semiHidden/>
     <w:rsid w:val="00C47B31"/>
@@ -6082,11 +6274,11 @@
       <w:color w:val="272727" w:themeColor="text1" w:themeTint="D8"/>
     </w:rPr>
   </w:style>
-  <w:style w:type="paragraph" w:styleId="Ttulo">
+  <w:style w:type="paragraph" w:styleId="Title">
     <w:name w:val="Title"/>
     <w:basedOn w:val="Normal"/>
     <w:next w:val="Normal"/>
-    <w:link w:val="TtuloCar"/>
+    <w:link w:val="TitleChar"/>
     <w:uiPriority w:val="10"/>
     <w:qFormat/>
     <w:rsid w:val="00C47B31"/>
@@ -6102,10 +6294,10 @@
       <w:szCs w:val="56"/>
     </w:rPr>
   </w:style>
-  <w:style w:type="character" w:customStyle="1" w:styleId="TtuloCar">
-    <w:name w:val="Título Car"/>
-    <w:basedOn w:val="Fuentedeprrafopredeter"/>
-    <w:link w:val="Ttulo"/>
+  <w:style w:type="character" w:customStyle="1" w:styleId="TitleChar">
+    <w:name w:val="Title Char"/>
+    <w:basedOn w:val="DefaultParagraphFont"/>
+    <w:link w:val="Title"/>
     <w:uiPriority w:val="10"/>
     <w:rsid w:val="00C47B31"/>
     <w:rPr>
@@ -6116,11 +6308,11 @@
       <w:szCs w:val="56"/>
     </w:rPr>
   </w:style>
-  <w:style w:type="paragraph" w:styleId="Subttulo">
+  <w:style w:type="paragraph" w:styleId="Subtitle">
     <w:name w:val="Subtitle"/>
     <w:basedOn w:val="Normal"/>
     <w:next w:val="Normal"/>
-    <w:link w:val="SubttuloCar"/>
+    <w:link w:val="SubtitleChar"/>
     <w:uiPriority w:val="11"/>
     <w:qFormat/>
     <w:rsid w:val="00C47B31"/>
@@ -6138,10 +6330,10 @@
       <w:szCs w:val="28"/>
     </w:rPr>
   </w:style>
-  <w:style w:type="character" w:customStyle="1" w:styleId="SubttuloCar">
-    <w:name w:val="Subtítulo Car"/>
-    <w:basedOn w:val="Fuentedeprrafopredeter"/>
-    <w:link w:val="Subttulo"/>
+  <w:style w:type="character" w:customStyle="1" w:styleId="SubtitleChar">
+    <w:name w:val="Subtitle Char"/>
+    <w:basedOn w:val="DefaultParagraphFont"/>
+    <w:link w:val="Subtitle"/>
     <w:uiPriority w:val="11"/>
     <w:rsid w:val="00C47B31"/>
     <w:rPr>
@@ -6152,11 +6344,11 @@
       <w:szCs w:val="28"/>
     </w:rPr>
   </w:style>
-  <w:style w:type="paragraph" w:styleId="Cita">
+  <w:style w:type="paragraph" w:styleId="Quote">
     <w:name w:val="Quote"/>
     <w:basedOn w:val="Normal"/>
     <w:next w:val="Normal"/>
-    <w:link w:val="CitaCar"/>
+    <w:link w:val="QuoteChar"/>
     <w:uiPriority w:val="29"/>
     <w:qFormat/>
     <w:rsid w:val="00C47B31"/>
@@ -6170,10 +6362,10 @@
       <w:color w:val="404040" w:themeColor="text1" w:themeTint="BF"/>
     </w:rPr>
   </w:style>
-  <w:style w:type="character" w:customStyle="1" w:styleId="CitaCar">
-    <w:name w:val="Cita Car"/>
-    <w:basedOn w:val="Fuentedeprrafopredeter"/>
-    <w:link w:val="Cita"/>
+  <w:style w:type="character" w:customStyle="1" w:styleId="QuoteChar">
+    <w:name w:val="Quote Char"/>
+    <w:basedOn w:val="DefaultParagraphFont"/>
+    <w:link w:val="Quote"/>
     <w:uiPriority w:val="29"/>
     <w:rsid w:val="00C47B31"/>
     <w:rPr>
@@ -6182,7 +6374,7 @@
       <w:color w:val="404040" w:themeColor="text1" w:themeTint="BF"/>
     </w:rPr>
   </w:style>
-  <w:style w:type="paragraph" w:styleId="Prrafodelista">
+  <w:style w:type="paragraph" w:styleId="ListParagraph">
     <w:name w:val="List Paragraph"/>
     <w:basedOn w:val="Normal"/>
     <w:uiPriority w:val="34"/>
@@ -6193,9 +6385,9 @@
       <w:contextualSpacing/>
     </w:pPr>
   </w:style>
-  <w:style w:type="character" w:styleId="nfasisintenso">
+  <w:style w:type="character" w:styleId="IntenseEmphasis">
     <w:name w:val="Intense Emphasis"/>
-    <w:basedOn w:val="Fuentedeprrafopredeter"/>
+    <w:basedOn w:val="DefaultParagraphFont"/>
     <w:uiPriority w:val="21"/>
     <w:qFormat/>
     <w:rsid w:val="00C47B31"/>
@@ -6205,11 +6397,11 @@
       <w:color w:val="0F4761" w:themeColor="accent1" w:themeShade="BF"/>
     </w:rPr>
   </w:style>
-  <w:style w:type="paragraph" w:styleId="Citadestacada">
+  <w:style w:type="paragraph" w:styleId="IntenseQuote">
     <w:name w:val="Intense Quote"/>
     <w:basedOn w:val="Normal"/>
     <w:next w:val="Normal"/>
-    <w:link w:val="CitadestacadaCar"/>
+    <w:link w:val="IntenseQuoteChar"/>
     <w:uiPriority w:val="30"/>
     <w:qFormat/>
     <w:rsid w:val="00C47B31"/>
@@ -6228,10 +6420,10 @@
       <w:color w:val="0F4761" w:themeColor="accent1" w:themeShade="BF"/>
     </w:rPr>
   </w:style>
-  <w:style w:type="character" w:customStyle="1" w:styleId="CitadestacadaCar">
-    <w:name w:val="Cita destacada Car"/>
-    <w:basedOn w:val="Fuentedeprrafopredeter"/>
-    <w:link w:val="Citadestacada"/>
+  <w:style w:type="character" w:customStyle="1" w:styleId="IntenseQuoteChar">
+    <w:name w:val="Intense Quote Char"/>
+    <w:basedOn w:val="DefaultParagraphFont"/>
+    <w:link w:val="IntenseQuote"/>
     <w:uiPriority w:val="30"/>
     <w:rsid w:val="00C47B31"/>
     <w:rPr>
@@ -6240,9 +6432,9 @@
       <w:color w:val="0F4761" w:themeColor="accent1" w:themeShade="BF"/>
     </w:rPr>
   </w:style>
-  <w:style w:type="character" w:styleId="Referenciaintensa">
+  <w:style w:type="character" w:styleId="IntenseReference">
     <w:name w:val="Intense Reference"/>
-    <w:basedOn w:val="Fuentedeprrafopredeter"/>
+    <w:basedOn w:val="DefaultParagraphFont"/>
     <w:uiPriority w:val="32"/>
     <w:qFormat/>
     <w:rsid w:val="00C47B31"/>
@@ -6254,10 +6446,10 @@
       <w:spacing w:val="5"/>
     </w:rPr>
   </w:style>
-  <w:style w:type="paragraph" w:styleId="Encabezado">
+  <w:style w:type="paragraph" w:styleId="Header">
     <w:name w:val="header"/>
     <w:basedOn w:val="Normal"/>
-    <w:link w:val="EncabezadoCar"/>
+    <w:link w:val="HeaderChar"/>
     <w:uiPriority w:val="99"/>
     <w:unhideWhenUsed/>
     <w:rsid w:val="00351BE8"/>
@@ -6268,17 +6460,17 @@
       </w:tabs>
     </w:pPr>
   </w:style>
-  <w:style w:type="character" w:customStyle="1" w:styleId="EncabezadoCar">
-    <w:name w:val="Encabezado Car"/>
-    <w:basedOn w:val="Fuentedeprrafopredeter"/>
-    <w:link w:val="Encabezado"/>
+  <w:style w:type="character" w:customStyle="1" w:styleId="HeaderChar">
+    <w:name w:val="Header Char"/>
+    <w:basedOn w:val="DefaultParagraphFont"/>
+    <w:link w:val="Header"/>
     <w:uiPriority w:val="99"/>
     <w:rsid w:val="00351BE8"/>
   </w:style>
-  <w:style w:type="paragraph" w:styleId="Piedepgina">
+  <w:style w:type="paragraph" w:styleId="Footer">
     <w:name w:val="footer"/>
     <w:basedOn w:val="Normal"/>
-    <w:link w:val="PiedepginaCar"/>
+    <w:link w:val="FooterChar"/>
     <w:uiPriority w:val="99"/>
     <w:unhideWhenUsed/>
     <w:rsid w:val="00351BE8"/>
@@ -6289,16 +6481,16 @@
       </w:tabs>
     </w:pPr>
   </w:style>
-  <w:style w:type="character" w:customStyle="1" w:styleId="PiedepginaCar">
-    <w:name w:val="Pie de página Car"/>
-    <w:basedOn w:val="Fuentedeprrafopredeter"/>
-    <w:link w:val="Piedepgina"/>
+  <w:style w:type="character" w:customStyle="1" w:styleId="FooterChar">
+    <w:name w:val="Footer Char"/>
+    <w:basedOn w:val="DefaultParagraphFont"/>
+    <w:link w:val="Footer"/>
     <w:uiPriority w:val="99"/>
     <w:rsid w:val="00351BE8"/>
   </w:style>
-  <w:style w:type="table" w:styleId="Tablaconcuadrcula6concolores-nfasis1">
+  <w:style w:type="table" w:styleId="GridTable6Colorful-Accent1">
     <w:name w:val="Grid Table 6 Colorful Accent 1"/>
-    <w:basedOn w:val="Tablanormal"/>
+    <w:basedOn w:val="TableNormal"/>
     <w:uiPriority w:val="51"/>
     <w:rsid w:val="002631C5"/>
     <w:rPr>
@@ -6365,9 +6557,9 @@
       </w:tcPr>
     </w:tblStylePr>
   </w:style>
-  <w:style w:type="table" w:styleId="Tablaconcuadrcula1clara-nfasis4">
+  <w:style w:type="table" w:styleId="GridTable1Light-Accent4">
     <w:name w:val="Grid Table 1 Light Accent 4"/>
-    <w:basedOn w:val="Tablanormal"/>
+    <w:basedOn w:val="TableNormal"/>
     <w:uiPriority w:val="46"/>
     <w:rsid w:val="002631C5"/>
     <w:tblPr>
@@ -6419,9 +6611,9 @@
       </w:rPr>
     </w:tblStylePr>
   </w:style>
-  <w:style w:type="table" w:styleId="Tabladecuadrcula3">
+  <w:style w:type="table" w:styleId="GridTable3">
     <w:name w:val="Grid Table 3"/>
-    <w:basedOn w:val="Tablanormal"/>
+    <w:basedOn w:val="TableNormal"/>
     <w:uiPriority w:val="48"/>
     <w:rsid w:val="007B10C8"/>
     <w:tblPr>
@@ -6552,9 +6744,9 @@
       </w:tcPr>
     </w:tblStylePr>
   </w:style>
-  <w:style w:type="paragraph" w:styleId="Sinespaciado">
+  <w:style w:type="paragraph" w:styleId="NoSpacing">
     <w:name w:val="No Spacing"/>
-    <w:link w:val="SinespaciadoCar"/>
+    <w:link w:val="NoSpacingChar"/>
     <w:uiPriority w:val="1"/>
     <w:qFormat/>
     <w:rsid w:val="00B651A2"/>
@@ -6567,10 +6759,10 @@
       <w14:ligatures w14:val="none"/>
     </w:rPr>
   </w:style>
-  <w:style w:type="character" w:customStyle="1" w:styleId="SinespaciadoCar">
-    <w:name w:val="Sin espaciado Car"/>
-    <w:basedOn w:val="Fuentedeprrafopredeter"/>
-    <w:link w:val="Sinespaciado"/>
+  <w:style w:type="character" w:customStyle="1" w:styleId="NoSpacingChar">
+    <w:name w:val="No Spacing Char"/>
+    <w:basedOn w:val="DefaultParagraphFont"/>
+    <w:link w:val="NoSpacing"/>
     <w:uiPriority w:val="1"/>
     <w:rsid w:val="00B651A2"/>
     <w:rPr>
@@ -6582,9 +6774,9 @@
       <w14:ligatures w14:val="none"/>
     </w:rPr>
   </w:style>
-  <w:style w:type="table" w:styleId="Tablaconcuadrcula">
+  <w:style w:type="table" w:styleId="TableGrid">
     <w:name w:val="Table Grid"/>
-    <w:basedOn w:val="Tablanormal"/>
+    <w:basedOn w:val="TableNormal"/>
     <w:uiPriority w:val="39"/>
     <w:rsid w:val="00B651A2"/>
     <w:tblPr>
@@ -6598,9 +6790,9 @@
       </w:tblBorders>
     </w:tblPr>
   </w:style>
-  <w:style w:type="table" w:styleId="Tablaconcuadrcula4-nfasis1">
+  <w:style w:type="table" w:styleId="GridTable4-Accent1">
     <w:name w:val="Grid Table 4 Accent 1"/>
-    <w:basedOn w:val="Tablanormal"/>
+    <w:basedOn w:val="TableNormal"/>
     <w:uiPriority w:val="49"/>
     <w:rsid w:val="00B651A2"/>
     <w:tblPr>
@@ -6671,9 +6863,9 @@
       </w:tcPr>
     </w:tblStylePr>
   </w:style>
-  <w:style w:type="paragraph" w:styleId="TtuloTDC">
+  <w:style w:type="paragraph" w:styleId="TOCHeading">
     <w:name w:val="TOC Heading"/>
-    <w:basedOn w:val="Ttulo1"/>
+    <w:basedOn w:val="Heading1"/>
     <w:next w:val="Normal"/>
     <w:uiPriority w:val="39"/>
     <w:unhideWhenUsed/>
@@ -6693,7 +6885,7 @@
       <w14:ligatures w14:val="none"/>
     </w:rPr>
   </w:style>
-  <w:style w:type="paragraph" w:styleId="TDC1">
+  <w:style w:type="paragraph" w:styleId="TOC1">
     <w:name w:val="toc 1"/>
     <w:basedOn w:val="Normal"/>
     <w:next w:val="Normal"/>
@@ -6705,7 +6897,7 @@
       <w:spacing w:after="100"/>
     </w:pPr>
   </w:style>
-  <w:style w:type="paragraph" w:styleId="TDC2">
+  <w:style w:type="paragraph" w:styleId="TOC2">
     <w:name w:val="toc 2"/>
     <w:basedOn w:val="Normal"/>
     <w:next w:val="Normal"/>
@@ -6718,9 +6910,9 @@
       <w:ind w:left="240"/>
     </w:pPr>
   </w:style>
-  <w:style w:type="character" w:styleId="Hipervnculo">
+  <w:style w:type="character" w:styleId="Hyperlink">
     <w:name w:val="Hyperlink"/>
-    <w:basedOn w:val="Fuentedeprrafopredeter"/>
+    <w:basedOn w:val="DefaultParagraphFont"/>
     <w:uiPriority w:val="99"/>
     <w:unhideWhenUsed/>
     <w:rsid w:val="007E5604"/>
@@ -6729,9 +6921,9 @@
       <w:u w:val="single"/>
     </w:rPr>
   </w:style>
-  <w:style w:type="character" w:styleId="Mencinsinresolver">
+  <w:style w:type="character" w:styleId="UnresolvedMention">
     <w:name w:val="Unresolved Mention"/>
-    <w:basedOn w:val="Fuentedeprrafopredeter"/>
+    <w:basedOn w:val="DefaultParagraphFont"/>
     <w:uiPriority w:val="99"/>
     <w:semiHidden/>
     <w:unhideWhenUsed/>

</xml_diff>